<commit_message>
update report for topic 04
</commit_message>
<xml_diff>
--- a/TP-KB-251-NikolayenkoDmytro-lpr.docx
+++ b/TP-KB-251-NikolayenkoDmytro-lpr.docx
@@ -8323,19 +8323,7 @@
         <w:rPr>
           <w:lang w:val="ru-UA"/>
         </w:rPr>
-        <w:t>ко</w:t>
-      </w:r>
-      <w:r>
-        <w:rPr>
-          <w:lang w:val="ru-UA"/>
-        </w:rPr>
-        <w:t xml:space="preserve">лекції даних </w:t>
-      </w:r>
-      <w:r>
-        <w:rPr>
-          <w:lang w:val="ru-UA"/>
-        </w:rPr>
-        <w:t>та алгоритми пошуку</w:t>
+        <w:t>колекції даних та алгоритми пошуку</w:t>
       </w:r>
     </w:p>
     <w:p>
@@ -8458,6 +8446,7 @@
         <w:spacing w:line="360" w:lineRule="auto"/>
         <w:rPr>
           <w:sz w:val="28"/>
+          <w:lang w:val="ru-RU"/>
         </w:rPr>
       </w:pPr>
     </w:p>
@@ -8578,9 +8567,9 @@
       </w:pPr>
       <w:r>
         <w:rPr>
-          <w:sz w:val="28"/>
-          <w:szCs w:val="28"/>
-          <w:lang w:val="ru-UA"/>
+          <w:noProof/>
+          <w:sz w:val="28"/>
+          <w:szCs w:val="28"/>
         </w:rPr>
         <w:lastRenderedPageBreak/>
         <w:drawing>
@@ -11230,9 +11219,9 @@
         <w:rPr>
           <w:i/>
           <w:iCs/>
-          <w:sz w:val="28"/>
-          <w:szCs w:val="28"/>
-          <w:lang w:val="ru-UA"/>
+          <w:noProof/>
+          <w:sz w:val="28"/>
+          <w:szCs w:val="28"/>
         </w:rPr>
         <w:drawing>
           <wp:inline distT="0" distB="0" distL="0" distR="0" wp14:anchorId="772F9086" wp14:editId="7B088B0F">
@@ -13496,9 +13485,9 @@
         <w:rPr>
           <w:i/>
           <w:iCs/>
-          <w:sz w:val="28"/>
-          <w:szCs w:val="28"/>
-          <w:lang w:val="ru-UA"/>
+          <w:noProof/>
+          <w:sz w:val="28"/>
+          <w:szCs w:val="28"/>
         </w:rPr>
         <w:drawing>
           <wp:inline distT="0" distB="0" distL="0" distR="0" wp14:anchorId="25B63B34" wp14:editId="093691E8">
@@ -15275,9 +15264,9 @@
         <w:rPr>
           <w:i/>
           <w:iCs/>
-          <w:sz w:val="28"/>
-          <w:szCs w:val="28"/>
-          <w:lang w:val="ru-UA"/>
+          <w:noProof/>
+          <w:sz w:val="28"/>
+          <w:szCs w:val="28"/>
         </w:rPr>
         <w:drawing>
           <wp:inline distT="0" distB="0" distL="0" distR="0" wp14:anchorId="0EA81FBC" wp14:editId="62D62B9D">
@@ -16616,8 +16605,6 @@
           <w:szCs w:val="28"/>
         </w:rPr>
       </w:pPr>
-      <w:bookmarkStart w:id="0" w:name="_GoBack"/>
-      <w:bookmarkEnd w:id="0"/>
     </w:p>
     <w:p>
       <w:pPr>
@@ -16768,8 +16755,2856 @@
         </w:rPr>
       </w:pPr>
     </w:p>
+    <w:p>
+      <w:pPr>
+        <w:jc w:val="right"/>
+        <w:rPr>
+          <w:lang w:val="uk-UA"/>
+        </w:rPr>
+      </w:pPr>
+      <w:r>
+        <w:rPr>
+          <w:lang w:val="uk-UA"/>
+        </w:rPr>
+        <w:lastRenderedPageBreak/>
+        <w:t>Звіт до Теми №4</w:t>
+      </w:r>
+    </w:p>
+    <w:p>
+      <w:pPr>
+        <w:jc w:val="right"/>
+        <w:rPr>
+          <w:lang w:val="ru-UA"/>
+        </w:rPr>
+      </w:pPr>
+      <w:r>
+        <w:rPr>
+          <w:lang w:val="ru-UA"/>
+        </w:rPr>
+        <w:t>Обробка виняткових ситуацій</w:t>
+      </w:r>
+    </w:p>
+    <w:p>
+      <w:pPr>
+        <w:pStyle w:val="a5"/>
+        <w:spacing w:line="360" w:lineRule="auto"/>
+        <w:ind w:firstLine="567"/>
+        <w:rPr>
+          <w:sz w:val="28"/>
+          <w:szCs w:val="28"/>
+          <w:lang w:val="ru-UA"/>
+        </w:rPr>
+      </w:pPr>
+      <w:r>
+        <w:rPr>
+          <w:sz w:val="28"/>
+          <w:szCs w:val="28"/>
+          <w:lang w:val="ru-UA"/>
+        </w:rPr>
+        <w:t>Під час виконання практичного завдання до Теми №4 було надано варіанти рішення до наступних задач:</w:t>
+      </w:r>
+    </w:p>
+    <w:p>
+      <w:pPr>
+        <w:pStyle w:val="a5"/>
+        <w:numPr>
+          <w:ilvl w:val="0"/>
+          <w:numId w:val="17"/>
+        </w:numPr>
+        <w:spacing w:line="360" w:lineRule="auto"/>
+        <w:rPr>
+          <w:sz w:val="28"/>
+          <w:szCs w:val="28"/>
+          <w:lang w:val="ru-UA"/>
+        </w:rPr>
+      </w:pPr>
+      <w:r>
+        <w:rPr>
+          <w:sz w:val="28"/>
+          <w:szCs w:val="28"/>
+          <w:lang w:val="ru-UA"/>
+        </w:rPr>
+        <w:t>Розширити програму калькулятор функцією запитів даних для виконання операцій від користувача, що обробляє виняткові ситуації.</w:t>
+      </w:r>
+    </w:p>
+    <w:p>
+      <w:pPr>
+        <w:pStyle w:val="a5"/>
+        <w:numPr>
+          <w:ilvl w:val="0"/>
+          <w:numId w:val="17"/>
+        </w:numPr>
+        <w:spacing w:line="360" w:lineRule="auto"/>
+        <w:rPr>
+          <w:sz w:val="28"/>
+          <w:szCs w:val="28"/>
+          <w:lang w:val="ru-UA"/>
+        </w:rPr>
+      </w:pPr>
+      <w:r>
+        <w:rPr>
+          <w:sz w:val="28"/>
+          <w:szCs w:val="28"/>
+          <w:lang w:val="ru-UA"/>
+        </w:rPr>
+        <w:t>Розширити функцію ділення обробкою виняткової ситуації ділення на нуль.</w:t>
+      </w:r>
+    </w:p>
+    <w:p>
+      <w:pPr>
+        <w:pStyle w:val="a5"/>
+        <w:numPr>
+          <w:ilvl w:val="0"/>
+          <w:numId w:val="17"/>
+        </w:numPr>
+        <w:spacing w:line="360" w:lineRule="auto"/>
+        <w:rPr>
+          <w:sz w:val="28"/>
+          <w:szCs w:val="28"/>
+          <w:lang w:val="ru-UA"/>
+        </w:rPr>
+      </w:pPr>
+      <w:r>
+        <w:rPr>
+          <w:sz w:val="28"/>
+          <w:szCs w:val="28"/>
+          <w:lang w:val="ru-UA"/>
+        </w:rPr>
+        <w:t>Ознайомитись зі списком виняткових ситуацій за офіційною документацією Python.</w:t>
+      </w:r>
+    </w:p>
+    <w:p>
+      <w:pPr>
+        <w:pStyle w:val="a5"/>
+        <w:spacing w:line="360" w:lineRule="auto"/>
+        <w:ind w:left="360"/>
+        <w:rPr>
+          <w:sz w:val="28"/>
+          <w:szCs w:val="28"/>
+          <w:lang w:val="ru-UA"/>
+        </w:rPr>
+      </w:pPr>
+    </w:p>
+    <w:p>
+      <w:pPr>
+        <w:pStyle w:val="a5"/>
+        <w:spacing w:line="360" w:lineRule="auto"/>
+        <w:ind w:firstLine="567"/>
+        <w:rPr>
+          <w:sz w:val="28"/>
+          <w:szCs w:val="28"/>
+          <w:lang w:val="ru-UA"/>
+        </w:rPr>
+      </w:pPr>
+      <w:r>
+        <w:rPr>
+          <w:sz w:val="28"/>
+          <w:szCs w:val="28"/>
+          <w:lang w:val="ru-UA"/>
+        </w:rPr>
+        <w:t>Хід роботи:</w:t>
+      </w:r>
+    </w:p>
+    <w:p>
+      <w:pPr>
+        <w:pStyle w:val="a5"/>
+        <w:numPr>
+          <w:ilvl w:val="0"/>
+          <w:numId w:val="15"/>
+        </w:numPr>
+        <w:spacing w:line="360" w:lineRule="auto"/>
+        <w:ind w:firstLine="567"/>
+        <w:rPr>
+          <w:sz w:val="28"/>
+          <w:szCs w:val="28"/>
+          <w:lang w:val="ru-UA"/>
+        </w:rPr>
+      </w:pPr>
+      <w:r>
+        <w:rPr>
+          <w:sz w:val="28"/>
+          <w:szCs w:val="28"/>
+          <w:lang w:val="ru-UA"/>
+        </w:rPr>
+        <w:t>У робочому каталозі локального репозиторію створено нову директорію topic_04 для виконання поточного практичного завдання.</w:t>
+      </w:r>
+    </w:p>
+    <w:p>
+      <w:pPr>
+        <w:pStyle w:val="a5"/>
+        <w:numPr>
+          <w:ilvl w:val="0"/>
+          <w:numId w:val="15"/>
+        </w:numPr>
+        <w:spacing w:line="360" w:lineRule="auto"/>
+        <w:ind w:firstLine="567"/>
+        <w:rPr>
+          <w:sz w:val="28"/>
+          <w:szCs w:val="28"/>
+          <w:lang w:val="ru-UA"/>
+        </w:rPr>
+      </w:pPr>
+      <w:r>
+        <w:rPr>
+          <w:sz w:val="28"/>
+          <w:szCs w:val="28"/>
+          <w:lang w:val="ru-UA"/>
+        </w:rPr>
+        <w:t>Опрацьовано офіційну документацію мови Python щодо вбудованих виняткових ситуацій (Exceptions).</w:t>
+      </w:r>
+    </w:p>
+    <w:p>
+      <w:pPr>
+        <w:pStyle w:val="a5"/>
+        <w:numPr>
+          <w:ilvl w:val="0"/>
+          <w:numId w:val="15"/>
+        </w:numPr>
+        <w:spacing w:line="360" w:lineRule="auto"/>
+        <w:ind w:firstLine="567"/>
+        <w:rPr>
+          <w:sz w:val="28"/>
+          <w:szCs w:val="28"/>
+          <w:lang w:val="ru-UA"/>
+        </w:rPr>
+      </w:pPr>
+      <w:r>
+        <w:rPr>
+          <w:sz w:val="28"/>
+          <w:szCs w:val="28"/>
+          <w:lang w:val="ru-UA"/>
+        </w:rPr>
+        <w:t xml:space="preserve">У файлі task1.py модифіковано програму-калькулятор з попередньої теми. Створено нову окрему функцію для безпечного введення числових даних. У цій функції реалізовано конструкцію </w:t>
+      </w:r>
+      <w:r>
+        <w:rPr>
+          <w:rStyle w:val="HTML"/>
+          <w:rFonts w:ascii="Times New Roman" w:hAnsi="Times New Roman" w:cs="Times New Roman"/>
+          <w:sz w:val="28"/>
+          <w:szCs w:val="28"/>
+          <w:lang w:val="ru-UA"/>
+        </w:rPr>
+        <w:t>try/except</w:t>
+      </w:r>
+      <w:r>
+        <w:rPr>
+          <w:sz w:val="28"/>
+          <w:szCs w:val="28"/>
+          <w:lang w:val="ru-UA"/>
+        </w:rPr>
+        <w:t xml:space="preserve"> для перехоплення помилки </w:t>
+      </w:r>
+      <w:r>
+        <w:rPr>
+          <w:rStyle w:val="HTML"/>
+          <w:rFonts w:ascii="Times New Roman" w:hAnsi="Times New Roman" w:cs="Times New Roman"/>
+          <w:sz w:val="28"/>
+          <w:szCs w:val="28"/>
+          <w:lang w:val="ru-UA"/>
+        </w:rPr>
+        <w:t>ValueError</w:t>
+      </w:r>
+      <w:r>
+        <w:rPr>
+          <w:sz w:val="28"/>
+          <w:szCs w:val="28"/>
+          <w:lang w:val="ru-UA"/>
+        </w:rPr>
+        <w:t xml:space="preserve"> (спроба перетворення тексту на число), а також цикл </w:t>
+      </w:r>
+      <w:r>
+        <w:rPr>
+          <w:rStyle w:val="HTML"/>
+          <w:rFonts w:ascii="Times New Roman" w:hAnsi="Times New Roman" w:cs="Times New Roman"/>
+          <w:sz w:val="28"/>
+          <w:szCs w:val="28"/>
+          <w:lang w:val="ru-UA"/>
+        </w:rPr>
+        <w:t>while</w:t>
+      </w:r>
+      <w:r>
+        <w:rPr>
+          <w:sz w:val="28"/>
+          <w:szCs w:val="28"/>
+          <w:lang w:val="ru-UA"/>
+        </w:rPr>
+        <w:t xml:space="preserve"> для повторного запиту даних у разі помилкового введення.</w:t>
+      </w:r>
+    </w:p>
+    <w:p>
+      <w:pPr>
+        <w:pStyle w:val="a5"/>
+        <w:numPr>
+          <w:ilvl w:val="0"/>
+          <w:numId w:val="15"/>
+        </w:numPr>
+        <w:spacing w:line="360" w:lineRule="auto"/>
+        <w:ind w:firstLine="567"/>
+        <w:rPr>
+          <w:sz w:val="28"/>
+          <w:szCs w:val="28"/>
+          <w:lang w:val="ru-UA"/>
+        </w:rPr>
+      </w:pPr>
+      <w:r>
+        <w:rPr>
+          <w:sz w:val="28"/>
+          <w:szCs w:val="28"/>
+          <w:lang w:val="ru-UA"/>
+        </w:rPr>
+        <w:lastRenderedPageBreak/>
+        <w:t xml:space="preserve">Оновлено функцію ділення. Замість перевірки через умовний оператор </w:t>
+      </w:r>
+      <w:r>
+        <w:rPr>
+          <w:rStyle w:val="HTML"/>
+          <w:rFonts w:ascii="Times New Roman" w:hAnsi="Times New Roman" w:cs="Times New Roman"/>
+          <w:sz w:val="28"/>
+          <w:szCs w:val="28"/>
+          <w:lang w:val="ru-UA"/>
+        </w:rPr>
+        <w:t>if</w:t>
+      </w:r>
+      <w:r>
+        <w:rPr>
+          <w:sz w:val="28"/>
+          <w:szCs w:val="28"/>
+          <w:lang w:val="ru-UA"/>
+        </w:rPr>
+        <w:t xml:space="preserve">, застосовано блок </w:t>
+      </w:r>
+      <w:r>
+        <w:rPr>
+          <w:rStyle w:val="HTML"/>
+          <w:rFonts w:ascii="Times New Roman" w:hAnsi="Times New Roman" w:cs="Times New Roman"/>
+          <w:sz w:val="28"/>
+          <w:szCs w:val="28"/>
+          <w:lang w:val="ru-UA"/>
+        </w:rPr>
+        <w:t>try/except</w:t>
+      </w:r>
+      <w:r>
+        <w:rPr>
+          <w:sz w:val="28"/>
+          <w:szCs w:val="28"/>
+          <w:lang w:val="ru-UA"/>
+        </w:rPr>
+        <w:t xml:space="preserve"> для безпосереднього перехоплення критичної помилки </w:t>
+      </w:r>
+      <w:r>
+        <w:rPr>
+          <w:rStyle w:val="HTML"/>
+          <w:rFonts w:ascii="Times New Roman" w:hAnsi="Times New Roman" w:cs="Times New Roman"/>
+          <w:sz w:val="28"/>
+          <w:szCs w:val="28"/>
+          <w:lang w:val="ru-UA"/>
+        </w:rPr>
+        <w:t>ZeroDivisionError</w:t>
+      </w:r>
+      <w:r>
+        <w:rPr>
+          <w:sz w:val="28"/>
+          <w:szCs w:val="28"/>
+          <w:lang w:val="ru-UA"/>
+        </w:rPr>
+        <w:t xml:space="preserve"> при спробі користувача поділити на нуль.</w:t>
+      </w:r>
+    </w:p>
+    <w:p>
+      <w:pPr>
+        <w:pStyle w:val="a5"/>
+        <w:numPr>
+          <w:ilvl w:val="0"/>
+          <w:numId w:val="15"/>
+        </w:numPr>
+        <w:spacing w:line="360" w:lineRule="auto"/>
+        <w:ind w:firstLine="567"/>
+        <w:rPr>
+          <w:sz w:val="28"/>
+          <w:szCs w:val="28"/>
+          <w:lang w:val="ru-UA"/>
+        </w:rPr>
+      </w:pPr>
+      <w:r>
+        <w:rPr>
+          <w:sz w:val="28"/>
+          <w:szCs w:val="28"/>
+          <w:lang w:val="ru-UA"/>
+        </w:rPr>
+        <w:t>Проведено комплексне тестування програми. Перевірено відпрацювання коректних математичних операцій, перехоплення тексту замість числа, обробку ділення на нуль та коректний вихід з програми.</w:t>
+      </w:r>
+    </w:p>
+    <w:p>
+      <w:pPr>
+        <w:pStyle w:val="a5"/>
+        <w:spacing w:line="360" w:lineRule="auto"/>
+        <w:ind w:firstLine="993"/>
+        <w:rPr>
+          <w:i/>
+          <w:iCs/>
+          <w:sz w:val="28"/>
+          <w:szCs w:val="28"/>
+          <w:lang w:val="ru-UA"/>
+        </w:rPr>
+      </w:pPr>
+      <w:r>
+        <w:rPr>
+          <w:noProof/>
+        </w:rPr>
+        <w:drawing>
+          <wp:inline distT="0" distB="0" distL="0" distR="0" wp14:anchorId="1250931B" wp14:editId="620293E5">
+            <wp:extent cx="4657725" cy="4295458"/>
+            <wp:effectExtent l="0" t="0" r="0" b="0"/>
+            <wp:docPr id="13" name="Рисунок 13"/>
+            <wp:cNvGraphicFramePr>
+              <a:graphicFrameLocks xmlns:a="http://schemas.openxmlformats.org/drawingml/2006/main" noChangeAspect="1"/>
+            </wp:cNvGraphicFramePr>
+            <a:graphic xmlns:a="http://schemas.openxmlformats.org/drawingml/2006/main">
+              <a:graphicData uri="http://schemas.openxmlformats.org/drawingml/2006/picture">
+                <pic:pic xmlns:pic="http://schemas.openxmlformats.org/drawingml/2006/picture">
+                  <pic:nvPicPr>
+                    <pic:cNvPr id="1" name=""/>
+                    <pic:cNvPicPr/>
+                  </pic:nvPicPr>
+                  <pic:blipFill>
+                    <a:blip r:embed="rId19"/>
+                    <a:stretch>
+                      <a:fillRect/>
+                    </a:stretch>
+                  </pic:blipFill>
+                  <pic:spPr>
+                    <a:xfrm>
+                      <a:off x="0" y="0"/>
+                      <a:ext cx="4671501" cy="4308163"/>
+                    </a:xfrm>
+                    <a:prstGeom prst="rect">
+                      <a:avLst/>
+                    </a:prstGeom>
+                  </pic:spPr>
+                </pic:pic>
+              </a:graphicData>
+            </a:graphic>
+          </wp:inline>
+        </w:drawing>
+      </w:r>
+    </w:p>
+    <w:p>
+      <w:pPr>
+        <w:pStyle w:val="a5"/>
+        <w:spacing w:line="360" w:lineRule="auto"/>
+        <w:ind w:firstLine="993"/>
+        <w:rPr>
+          <w:i/>
+          <w:iCs/>
+          <w:sz w:val="28"/>
+          <w:szCs w:val="28"/>
+          <w:lang w:val="ru-UA"/>
+        </w:rPr>
+      </w:pPr>
+    </w:p>
+    <w:p>
+      <w:pPr>
+        <w:pStyle w:val="a5"/>
+        <w:spacing w:line="360" w:lineRule="auto"/>
+        <w:ind w:firstLine="993"/>
+        <w:rPr>
+          <w:i/>
+          <w:iCs/>
+          <w:sz w:val="28"/>
+          <w:szCs w:val="28"/>
+          <w:lang w:val="ru-UA"/>
+        </w:rPr>
+      </w:pPr>
+    </w:p>
+    <w:p>
+      <w:pPr>
+        <w:ind w:firstLine="0"/>
+        <w:rPr>
+          <w:lang w:val="uk-UA"/>
+        </w:rPr>
+      </w:pPr>
+      <w:r>
+        <w:rPr>
+          <w:lang w:val="uk-UA"/>
+        </w:rPr>
+        <w:lastRenderedPageBreak/>
+        <w:t>Текст програми:</w:t>
+      </w:r>
+    </w:p>
+    <w:tbl>
+      <w:tblPr>
+        <w:tblStyle w:val="a3"/>
+        <w:tblW w:w="0" w:type="auto"/>
+        <w:tblInd w:w="-5" w:type="dxa"/>
+        <w:tblLook w:val="04A0" w:firstRow="1" w:lastRow="0" w:firstColumn="1" w:lastColumn="0" w:noHBand="0" w:noVBand="1"/>
+      </w:tblPr>
+      <w:tblGrid>
+        <w:gridCol w:w="8545"/>
+      </w:tblGrid>
+      <w:tr>
+        <w:trPr>
+          <w:trHeight w:val="70"/>
+        </w:trPr>
+        <w:tc>
+          <w:tcPr>
+            <w:tcW w:w="8545" w:type="dxa"/>
+            <w:tcBorders>
+              <w:top w:val="single" w:sz="4" w:space="0" w:color="auto"/>
+              <w:left w:val="single" w:sz="4" w:space="0" w:color="auto"/>
+              <w:bottom w:val="single" w:sz="4" w:space="0" w:color="auto"/>
+              <w:right w:val="single" w:sz="4" w:space="0" w:color="auto"/>
+            </w:tcBorders>
+            <w:hideMark/>
+          </w:tcPr>
+          <w:p>
+            <w:pPr>
+              <w:pStyle w:val="HTML0"/>
+              <w:shd w:val="clear" w:color="auto" w:fill="191A1C"/>
+              <w:rPr>
+                <w:color w:val="BCBEC4"/>
+                <w:lang w:val="ru-RU"/>
+              </w:rPr>
+            </w:pPr>
+            <w:proofErr w:type="spellStart"/>
+            <w:r>
+              <w:rPr>
+                <w:color w:val="CF8E6D"/>
+              </w:rPr>
+              <w:t>def</w:t>
+            </w:r>
+            <w:proofErr w:type="spellEnd"/>
+            <w:r>
+              <w:rPr>
+                <w:color w:val="CF8E6D"/>
+              </w:rPr>
+              <w:t xml:space="preserve"> </w:t>
+            </w:r>
+            <w:r>
+              <w:rPr>
+                <w:color w:val="56A8F5"/>
+              </w:rPr>
+              <w:t>add</w:t>
+            </w:r>
+            <w:r>
+              <w:rPr>
+                <w:color w:val="BCBEC4"/>
+              </w:rPr>
+              <w:t>(a, b):</w:t>
+            </w:r>
+            <w:r>
+              <w:rPr>
+                <w:color w:val="BCBEC4"/>
+              </w:rPr>
+              <w:br/>
+              <w:t xml:space="preserve">    </w:t>
+            </w:r>
+            <w:r>
+              <w:rPr>
+                <w:color w:val="CF8E6D"/>
+              </w:rPr>
+              <w:t xml:space="preserve">return </w:t>
+            </w:r>
+            <w:r>
+              <w:rPr>
+                <w:color w:val="BCBEC4"/>
+              </w:rPr>
+              <w:t>a + b</w:t>
+            </w:r>
+            <w:r>
+              <w:rPr>
+                <w:color w:val="BCBEC4"/>
+              </w:rPr>
+              <w:br/>
+            </w:r>
+            <w:proofErr w:type="spellStart"/>
+            <w:r>
+              <w:rPr>
+                <w:color w:val="CF8E6D"/>
+              </w:rPr>
+              <w:t>def</w:t>
+            </w:r>
+            <w:proofErr w:type="spellEnd"/>
+            <w:r>
+              <w:rPr>
+                <w:color w:val="CF8E6D"/>
+              </w:rPr>
+              <w:t xml:space="preserve"> </w:t>
+            </w:r>
+            <w:r>
+              <w:rPr>
+                <w:color w:val="56A8F5"/>
+              </w:rPr>
+              <w:t>sub</w:t>
+            </w:r>
+            <w:r>
+              <w:rPr>
+                <w:color w:val="BCBEC4"/>
+              </w:rPr>
+              <w:t>(a, b):</w:t>
+            </w:r>
+            <w:r>
+              <w:rPr>
+                <w:color w:val="BCBEC4"/>
+              </w:rPr>
+              <w:br/>
+              <w:t xml:space="preserve">    </w:t>
+            </w:r>
+            <w:r>
+              <w:rPr>
+                <w:color w:val="CF8E6D"/>
+              </w:rPr>
+              <w:t xml:space="preserve">return </w:t>
+            </w:r>
+            <w:r>
+              <w:rPr>
+                <w:color w:val="BCBEC4"/>
+              </w:rPr>
+              <w:t>a - b</w:t>
+            </w:r>
+            <w:r>
+              <w:rPr>
+                <w:color w:val="BCBEC4"/>
+              </w:rPr>
+              <w:br/>
+            </w:r>
+            <w:proofErr w:type="spellStart"/>
+            <w:r>
+              <w:rPr>
+                <w:color w:val="CF8E6D"/>
+              </w:rPr>
+              <w:t>def</w:t>
+            </w:r>
+            <w:proofErr w:type="spellEnd"/>
+            <w:r>
+              <w:rPr>
+                <w:color w:val="CF8E6D"/>
+              </w:rPr>
+              <w:t xml:space="preserve"> </w:t>
+            </w:r>
+            <w:proofErr w:type="spellStart"/>
+            <w:r>
+              <w:rPr>
+                <w:color w:val="56A8F5"/>
+              </w:rPr>
+              <w:t>mult</w:t>
+            </w:r>
+            <w:proofErr w:type="spellEnd"/>
+            <w:r>
+              <w:rPr>
+                <w:color w:val="BCBEC4"/>
+              </w:rPr>
+              <w:t>(a, b):</w:t>
+            </w:r>
+            <w:r>
+              <w:rPr>
+                <w:color w:val="BCBEC4"/>
+              </w:rPr>
+              <w:br/>
+              <w:t xml:space="preserve">    </w:t>
+            </w:r>
+            <w:r>
+              <w:rPr>
+                <w:color w:val="CF8E6D"/>
+              </w:rPr>
+              <w:t xml:space="preserve">return </w:t>
+            </w:r>
+            <w:r>
+              <w:rPr>
+                <w:color w:val="BCBEC4"/>
+              </w:rPr>
+              <w:t>a * b</w:t>
+            </w:r>
+            <w:r>
+              <w:rPr>
+                <w:color w:val="BCBEC4"/>
+              </w:rPr>
+              <w:br/>
+            </w:r>
+            <w:r>
+              <w:rPr>
+                <w:color w:val="BCBEC4"/>
+              </w:rPr>
+              <w:br/>
+            </w:r>
+            <w:r>
+              <w:rPr>
+                <w:color w:val="BCBEC4"/>
+              </w:rPr>
+              <w:br/>
+            </w:r>
+            <w:proofErr w:type="spellStart"/>
+            <w:r>
+              <w:rPr>
+                <w:color w:val="CF8E6D"/>
+              </w:rPr>
+              <w:t>def</w:t>
+            </w:r>
+            <w:proofErr w:type="spellEnd"/>
+            <w:r>
+              <w:rPr>
+                <w:color w:val="CF8E6D"/>
+              </w:rPr>
+              <w:t xml:space="preserve"> </w:t>
+            </w:r>
+            <w:r>
+              <w:rPr>
+                <w:color w:val="56A8F5"/>
+              </w:rPr>
+              <w:t>div</w:t>
+            </w:r>
+            <w:r>
+              <w:rPr>
+                <w:color w:val="BCBEC4"/>
+              </w:rPr>
+              <w:t>(a, b):</w:t>
+            </w:r>
+            <w:r>
+              <w:rPr>
+                <w:color w:val="BCBEC4"/>
+              </w:rPr>
+              <w:br/>
+              <w:t xml:space="preserve">    </w:t>
+            </w:r>
+            <w:r>
+              <w:rPr>
+                <w:color w:val="CF8E6D"/>
+              </w:rPr>
+              <w:t>try</w:t>
+            </w:r>
+            <w:r>
+              <w:rPr>
+                <w:color w:val="BCBEC4"/>
+              </w:rPr>
+              <w:t>:</w:t>
+            </w:r>
+            <w:r>
+              <w:rPr>
+                <w:color w:val="BCBEC4"/>
+              </w:rPr>
+              <w:br/>
+              <w:t xml:space="preserve">        </w:t>
+            </w:r>
+            <w:r>
+              <w:rPr>
+                <w:color w:val="CF8E6D"/>
+              </w:rPr>
+              <w:t xml:space="preserve">return </w:t>
+            </w:r>
+            <w:r>
+              <w:rPr>
+                <w:color w:val="BCBEC4"/>
+              </w:rPr>
+              <w:t>a / b</w:t>
+            </w:r>
+            <w:r>
+              <w:rPr>
+                <w:color w:val="BCBEC4"/>
+              </w:rPr>
+              <w:br/>
+              <w:t xml:space="preserve">    </w:t>
+            </w:r>
+            <w:r>
+              <w:rPr>
+                <w:color w:val="CF8E6D"/>
+              </w:rPr>
+              <w:t xml:space="preserve">except </w:t>
+            </w:r>
+            <w:proofErr w:type="spellStart"/>
+            <w:r>
+              <w:rPr>
+                <w:color w:val="8888C6"/>
+              </w:rPr>
+              <w:t>ZeroDivisionError</w:t>
+            </w:r>
+            <w:proofErr w:type="spellEnd"/>
+            <w:r>
+              <w:rPr>
+                <w:color w:val="BCBEC4"/>
+              </w:rPr>
+              <w:t>:</w:t>
+            </w:r>
+            <w:r>
+              <w:rPr>
+                <w:color w:val="BCBEC4"/>
+              </w:rPr>
+              <w:br/>
+              <w:t xml:space="preserve">        </w:t>
+            </w:r>
+            <w:r>
+              <w:rPr>
+                <w:color w:val="CF8E6D"/>
+              </w:rPr>
+              <w:t xml:space="preserve">return </w:t>
+            </w:r>
+            <w:r>
+              <w:rPr>
+                <w:color w:val="6AAB73"/>
+              </w:rPr>
+              <w:t>"</w:t>
+            </w:r>
+            <w:proofErr w:type="spellStart"/>
+            <w:r>
+              <w:rPr>
+                <w:color w:val="6AAB73"/>
+              </w:rPr>
+              <w:t>Помилка</w:t>
+            </w:r>
+            <w:proofErr w:type="spellEnd"/>
+            <w:r>
+              <w:rPr>
+                <w:color w:val="6AAB73"/>
+              </w:rPr>
+              <w:t xml:space="preserve">! </w:t>
+            </w:r>
+            <w:proofErr w:type="spellStart"/>
+            <w:r>
+              <w:rPr>
+                <w:color w:val="6AAB73"/>
+              </w:rPr>
+              <w:t>Ділення</w:t>
+            </w:r>
+            <w:proofErr w:type="spellEnd"/>
+            <w:r>
+              <w:rPr>
+                <w:color w:val="6AAB73"/>
+              </w:rPr>
+              <w:t xml:space="preserve"> </w:t>
+            </w:r>
+            <w:proofErr w:type="spellStart"/>
+            <w:r>
+              <w:rPr>
+                <w:color w:val="6AAB73"/>
+              </w:rPr>
+              <w:t>на</w:t>
+            </w:r>
+            <w:proofErr w:type="spellEnd"/>
+            <w:r>
+              <w:rPr>
+                <w:color w:val="6AAB73"/>
+              </w:rPr>
+              <w:t xml:space="preserve"> </w:t>
+            </w:r>
+            <w:proofErr w:type="spellStart"/>
+            <w:r>
+              <w:rPr>
+                <w:color w:val="6AAB73"/>
+              </w:rPr>
+              <w:t>нуль</w:t>
+            </w:r>
+            <w:proofErr w:type="spellEnd"/>
+            <w:r>
+              <w:rPr>
+                <w:color w:val="6AAB73"/>
+              </w:rPr>
+              <w:t xml:space="preserve"> (</w:t>
+            </w:r>
+            <w:proofErr w:type="spellStart"/>
+            <w:r>
+              <w:rPr>
+                <w:color w:val="6AAB73"/>
+              </w:rPr>
+              <w:t>перехоплено</w:t>
+            </w:r>
+            <w:proofErr w:type="spellEnd"/>
+            <w:r>
+              <w:rPr>
+                <w:color w:val="6AAB73"/>
+              </w:rPr>
+              <w:t xml:space="preserve"> </w:t>
+            </w:r>
+            <w:proofErr w:type="spellStart"/>
+            <w:r>
+              <w:rPr>
+                <w:color w:val="6AAB73"/>
+              </w:rPr>
+              <w:t>ZeroDivisionError</w:t>
+            </w:r>
+            <w:proofErr w:type="spellEnd"/>
+            <w:r>
+              <w:rPr>
+                <w:color w:val="6AAB73"/>
+              </w:rPr>
+              <w:t>)."</w:t>
+            </w:r>
+            <w:r>
+              <w:rPr>
+                <w:color w:val="6AAB73"/>
+              </w:rPr>
+              <w:br/>
+            </w:r>
+            <w:r>
+              <w:rPr>
+                <w:color w:val="6AAB73"/>
+              </w:rPr>
+              <w:br/>
+            </w:r>
+            <w:r>
+              <w:rPr>
+                <w:color w:val="6AAB73"/>
+              </w:rPr>
+              <w:br/>
+            </w:r>
+            <w:proofErr w:type="spellStart"/>
+            <w:r>
+              <w:rPr>
+                <w:color w:val="CF8E6D"/>
+              </w:rPr>
+              <w:t>def</w:t>
+            </w:r>
+            <w:proofErr w:type="spellEnd"/>
+            <w:r>
+              <w:rPr>
+                <w:color w:val="CF8E6D"/>
+              </w:rPr>
+              <w:t xml:space="preserve"> </w:t>
+            </w:r>
+            <w:proofErr w:type="spellStart"/>
+            <w:r>
+              <w:rPr>
+                <w:color w:val="56A8F5"/>
+              </w:rPr>
+              <w:t>get_number</w:t>
+            </w:r>
+            <w:proofErr w:type="spellEnd"/>
+            <w:r>
+              <w:rPr>
+                <w:color w:val="BCBEC4"/>
+              </w:rPr>
+              <w:t>(</w:t>
+            </w:r>
+            <w:proofErr w:type="spellStart"/>
+            <w:r>
+              <w:rPr>
+                <w:color w:val="BCBEC4"/>
+              </w:rPr>
+              <w:t>prompt_text</w:t>
+            </w:r>
+            <w:proofErr w:type="spellEnd"/>
+            <w:r>
+              <w:rPr>
+                <w:color w:val="BCBEC4"/>
+              </w:rPr>
+              <w:t>):</w:t>
+            </w:r>
+            <w:r>
+              <w:rPr>
+                <w:color w:val="BCBEC4"/>
+              </w:rPr>
+              <w:br/>
+              <w:t xml:space="preserve">    </w:t>
+            </w:r>
+            <w:r>
+              <w:rPr>
+                <w:color w:val="CF8E6D"/>
+              </w:rPr>
+              <w:t>while True</w:t>
+            </w:r>
+            <w:r>
+              <w:rPr>
+                <w:color w:val="BCBEC4"/>
+              </w:rPr>
+              <w:t>:</w:t>
+            </w:r>
+            <w:r>
+              <w:rPr>
+                <w:color w:val="BCBEC4"/>
+              </w:rPr>
+              <w:br/>
+              <w:t xml:space="preserve">        </w:t>
+            </w:r>
+            <w:r>
+              <w:rPr>
+                <w:color w:val="CF8E6D"/>
+              </w:rPr>
+              <w:t>try</w:t>
+            </w:r>
+            <w:r>
+              <w:rPr>
+                <w:color w:val="BCBEC4"/>
+              </w:rPr>
+              <w:t>:</w:t>
+            </w:r>
+            <w:r>
+              <w:rPr>
+                <w:color w:val="BCBEC4"/>
+              </w:rPr>
+              <w:br/>
+              <w:t xml:space="preserve">            </w:t>
+            </w:r>
+            <w:proofErr w:type="spellStart"/>
+            <w:r>
+              <w:rPr>
+                <w:color w:val="BCBEC4"/>
+              </w:rPr>
+              <w:t>user_input</w:t>
+            </w:r>
+            <w:proofErr w:type="spellEnd"/>
+            <w:r>
+              <w:rPr>
+                <w:color w:val="BCBEC4"/>
+              </w:rPr>
+              <w:t xml:space="preserve"> = </w:t>
+            </w:r>
+            <w:r>
+              <w:rPr>
+                <w:color w:val="8888C6"/>
+              </w:rPr>
+              <w:t>input</w:t>
+            </w:r>
+            <w:r>
+              <w:rPr>
+                <w:color w:val="BCBEC4"/>
+              </w:rPr>
+              <w:t>(</w:t>
+            </w:r>
+            <w:proofErr w:type="spellStart"/>
+            <w:r>
+              <w:rPr>
+                <w:color w:val="BCBEC4"/>
+              </w:rPr>
+              <w:t>prompt_text</w:t>
+            </w:r>
+            <w:proofErr w:type="spellEnd"/>
+            <w:r>
+              <w:rPr>
+                <w:color w:val="BCBEC4"/>
+              </w:rPr>
+              <w:t>)</w:t>
+            </w:r>
+            <w:r>
+              <w:rPr>
+                <w:color w:val="BCBEC4"/>
+              </w:rPr>
+              <w:br/>
+              <w:t xml:space="preserve">            </w:t>
+            </w:r>
+            <w:r>
+              <w:rPr>
+                <w:color w:val="CF8E6D"/>
+              </w:rPr>
+              <w:t xml:space="preserve">return </w:t>
+            </w:r>
+            <w:r>
+              <w:rPr>
+                <w:color w:val="8888C6"/>
+              </w:rPr>
+              <w:t>float</w:t>
+            </w:r>
+            <w:r>
+              <w:rPr>
+                <w:color w:val="BCBEC4"/>
+              </w:rPr>
+              <w:t>(</w:t>
+            </w:r>
+            <w:proofErr w:type="spellStart"/>
+            <w:r>
+              <w:rPr>
+                <w:color w:val="BCBEC4"/>
+              </w:rPr>
+              <w:t>user_input</w:t>
+            </w:r>
+            <w:proofErr w:type="spellEnd"/>
+            <w:r>
+              <w:rPr>
+                <w:color w:val="BCBEC4"/>
+              </w:rPr>
+              <w:t>)</w:t>
+            </w:r>
+            <w:r>
+              <w:rPr>
+                <w:color w:val="BCBEC4"/>
+              </w:rPr>
+              <w:br/>
+              <w:t xml:space="preserve">        </w:t>
+            </w:r>
+            <w:r>
+              <w:rPr>
+                <w:color w:val="CF8E6D"/>
+              </w:rPr>
+              <w:t xml:space="preserve">except </w:t>
+            </w:r>
+            <w:proofErr w:type="spellStart"/>
+            <w:r>
+              <w:rPr>
+                <w:color w:val="8888C6"/>
+              </w:rPr>
+              <w:t>ValueError</w:t>
+            </w:r>
+            <w:proofErr w:type="spellEnd"/>
+            <w:r>
+              <w:rPr>
+                <w:color w:val="BCBEC4"/>
+              </w:rPr>
+              <w:t>:</w:t>
+            </w:r>
+            <w:r>
+              <w:rPr>
+                <w:color w:val="BCBEC4"/>
+              </w:rPr>
+              <w:br/>
+              <w:t xml:space="preserve">            </w:t>
+            </w:r>
+            <w:r>
+              <w:rPr>
+                <w:color w:val="8888C6"/>
+              </w:rPr>
+              <w:t>print</w:t>
+            </w:r>
+            <w:r>
+              <w:rPr>
+                <w:color w:val="BCBEC4"/>
+              </w:rPr>
+              <w:t>(</w:t>
+            </w:r>
+            <w:r>
+              <w:rPr>
+                <w:color w:val="6AAB73"/>
+              </w:rPr>
+              <w:t>"</w:t>
+            </w:r>
+            <w:proofErr w:type="spellStart"/>
+            <w:r>
+              <w:rPr>
+                <w:color w:val="6AAB73"/>
+              </w:rPr>
+              <w:t>Помилка</w:t>
+            </w:r>
+            <w:proofErr w:type="spellEnd"/>
+            <w:r>
+              <w:rPr>
+                <w:color w:val="6AAB73"/>
+              </w:rPr>
+              <w:t xml:space="preserve">! </w:t>
+            </w:r>
+            <w:proofErr w:type="spellStart"/>
+            <w:r>
+              <w:rPr>
+                <w:color w:val="6AAB73"/>
+              </w:rPr>
+              <w:t>Ви</w:t>
+            </w:r>
+            <w:proofErr w:type="spellEnd"/>
+            <w:r>
+              <w:rPr>
+                <w:color w:val="6AAB73"/>
+              </w:rPr>
+              <w:t xml:space="preserve"> </w:t>
+            </w:r>
+            <w:proofErr w:type="spellStart"/>
+            <w:r>
+              <w:rPr>
+                <w:color w:val="6AAB73"/>
+              </w:rPr>
+              <w:t>ввели</w:t>
+            </w:r>
+            <w:proofErr w:type="spellEnd"/>
+            <w:r>
+              <w:rPr>
+                <w:color w:val="6AAB73"/>
+              </w:rPr>
+              <w:t xml:space="preserve"> </w:t>
+            </w:r>
+            <w:proofErr w:type="spellStart"/>
+            <w:r>
+              <w:rPr>
+                <w:color w:val="6AAB73"/>
+              </w:rPr>
+              <w:t>текст</w:t>
+            </w:r>
+            <w:proofErr w:type="spellEnd"/>
+            <w:r>
+              <w:rPr>
+                <w:color w:val="6AAB73"/>
+              </w:rPr>
+              <w:t xml:space="preserve"> </w:t>
+            </w:r>
+            <w:proofErr w:type="spellStart"/>
+            <w:r>
+              <w:rPr>
+                <w:color w:val="6AAB73"/>
+              </w:rPr>
+              <w:t>замість</w:t>
+            </w:r>
+            <w:proofErr w:type="spellEnd"/>
+            <w:r>
+              <w:rPr>
+                <w:color w:val="6AAB73"/>
+              </w:rPr>
+              <w:t xml:space="preserve"> </w:t>
+            </w:r>
+            <w:proofErr w:type="spellStart"/>
+            <w:r>
+              <w:rPr>
+                <w:color w:val="6AAB73"/>
+              </w:rPr>
+              <w:t>числа</w:t>
+            </w:r>
+            <w:proofErr w:type="spellEnd"/>
+            <w:r>
+              <w:rPr>
+                <w:color w:val="6AAB73"/>
+              </w:rPr>
+              <w:t xml:space="preserve">. </w:t>
+            </w:r>
+            <w:proofErr w:type="spellStart"/>
+            <w:r>
+              <w:rPr>
+                <w:color w:val="6AAB73"/>
+              </w:rPr>
+              <w:t>Спробуйте</w:t>
+            </w:r>
+            <w:proofErr w:type="spellEnd"/>
+            <w:r>
+              <w:rPr>
+                <w:color w:val="6AAB73"/>
+              </w:rPr>
+              <w:t xml:space="preserve"> </w:t>
+            </w:r>
+            <w:proofErr w:type="spellStart"/>
+            <w:r>
+              <w:rPr>
+                <w:color w:val="6AAB73"/>
+              </w:rPr>
+              <w:t>ще</w:t>
+            </w:r>
+            <w:proofErr w:type="spellEnd"/>
+            <w:r>
+              <w:rPr>
+                <w:color w:val="6AAB73"/>
+              </w:rPr>
+              <w:t xml:space="preserve"> </w:t>
+            </w:r>
+            <w:proofErr w:type="spellStart"/>
+            <w:r>
+              <w:rPr>
+                <w:color w:val="6AAB73"/>
+              </w:rPr>
+              <w:t>раз</w:t>
+            </w:r>
+            <w:proofErr w:type="spellEnd"/>
+            <w:r>
+              <w:rPr>
+                <w:color w:val="6AAB73"/>
+              </w:rPr>
+              <w:t>."</w:t>
+            </w:r>
+            <w:r>
+              <w:rPr>
+                <w:color w:val="BCBEC4"/>
+              </w:rPr>
+              <w:t>)</w:t>
+            </w:r>
+            <w:r>
+              <w:rPr>
+                <w:color w:val="BCBEC4"/>
+              </w:rPr>
+              <w:br/>
+            </w:r>
+            <w:r>
+              <w:rPr>
+                <w:color w:val="BCBEC4"/>
+              </w:rPr>
+              <w:br/>
+            </w:r>
+            <w:r>
+              <w:rPr>
+                <w:color w:val="BCBEC4"/>
+              </w:rPr>
+              <w:br/>
+            </w:r>
+            <w:r>
+              <w:rPr>
+                <w:color w:val="8888C6"/>
+              </w:rPr>
+              <w:t>print</w:t>
+            </w:r>
+            <w:r>
+              <w:rPr>
+                <w:color w:val="BCBEC4"/>
+              </w:rPr>
+              <w:t>(</w:t>
+            </w:r>
+            <w:r>
+              <w:rPr>
+                <w:color w:val="6AAB73"/>
+              </w:rPr>
+              <w:t xml:space="preserve">"=== </w:t>
+            </w:r>
+            <w:proofErr w:type="spellStart"/>
+            <w:r>
+              <w:rPr>
+                <w:color w:val="6AAB73"/>
+              </w:rPr>
+              <w:t>Безкінечний</w:t>
+            </w:r>
+            <w:proofErr w:type="spellEnd"/>
+            <w:r>
+              <w:rPr>
+                <w:color w:val="6AAB73"/>
+              </w:rPr>
+              <w:t xml:space="preserve"> </w:t>
+            </w:r>
+            <w:proofErr w:type="spellStart"/>
+            <w:r>
+              <w:rPr>
+                <w:color w:val="6AAB73"/>
+              </w:rPr>
+              <w:t>калькулятор</w:t>
+            </w:r>
+            <w:proofErr w:type="spellEnd"/>
+            <w:r>
+              <w:rPr>
+                <w:color w:val="6AAB73"/>
+              </w:rPr>
+              <w:t xml:space="preserve"> (Topic 04) ==="</w:t>
+            </w:r>
+            <w:r>
+              <w:rPr>
+                <w:color w:val="BCBEC4"/>
+              </w:rPr>
+              <w:t>)</w:t>
+            </w:r>
+            <w:r>
+              <w:rPr>
+                <w:color w:val="BCBEC4"/>
+              </w:rPr>
+              <w:br/>
+            </w:r>
+            <w:r>
+              <w:rPr>
+                <w:color w:val="8888C6"/>
+              </w:rPr>
+              <w:t>print</w:t>
+            </w:r>
+            <w:r>
+              <w:rPr>
+                <w:color w:val="BCBEC4"/>
+              </w:rPr>
+              <w:t>(</w:t>
+            </w:r>
+            <w:r>
+              <w:rPr>
+                <w:color w:val="6AAB73"/>
+              </w:rPr>
+              <w:t>"</w:t>
+            </w:r>
+            <w:proofErr w:type="spellStart"/>
+            <w:r>
+              <w:rPr>
+                <w:color w:val="6AAB73"/>
+              </w:rPr>
+              <w:t>Для</w:t>
+            </w:r>
+            <w:proofErr w:type="spellEnd"/>
+            <w:r>
+              <w:rPr>
+                <w:color w:val="6AAB73"/>
+              </w:rPr>
+              <w:t xml:space="preserve"> </w:t>
+            </w:r>
+            <w:proofErr w:type="spellStart"/>
+            <w:r>
+              <w:rPr>
+                <w:color w:val="6AAB73"/>
+              </w:rPr>
+              <w:t>виходу</w:t>
+            </w:r>
+            <w:proofErr w:type="spellEnd"/>
+            <w:r>
+              <w:rPr>
+                <w:color w:val="6AAB73"/>
+              </w:rPr>
+              <w:t xml:space="preserve"> </w:t>
+            </w:r>
+            <w:proofErr w:type="spellStart"/>
+            <w:r>
+              <w:rPr>
+                <w:color w:val="6AAB73"/>
+              </w:rPr>
+              <w:t>введіть</w:t>
+            </w:r>
+            <w:proofErr w:type="spellEnd"/>
+            <w:r>
+              <w:rPr>
+                <w:color w:val="6AAB73"/>
+              </w:rPr>
+              <w:t xml:space="preserve"> 'q' </w:t>
+            </w:r>
+            <w:proofErr w:type="spellStart"/>
+            <w:r>
+              <w:rPr>
+                <w:color w:val="6AAB73"/>
+              </w:rPr>
+              <w:t>або</w:t>
+            </w:r>
+            <w:proofErr w:type="spellEnd"/>
+            <w:r>
+              <w:rPr>
+                <w:color w:val="6AAB73"/>
+              </w:rPr>
+              <w:t xml:space="preserve"> 'exit'.</w:t>
+            </w:r>
+            <w:r>
+              <w:rPr>
+                <w:color w:val="CF8E6D"/>
+              </w:rPr>
+              <w:t>\n</w:t>
+            </w:r>
+            <w:r>
+              <w:rPr>
+                <w:color w:val="6AAB73"/>
+              </w:rPr>
+              <w:t>"</w:t>
+            </w:r>
+            <w:r>
+              <w:rPr>
+                <w:color w:val="BCBEC4"/>
+              </w:rPr>
+              <w:t>)</w:t>
+            </w:r>
+            <w:r>
+              <w:rPr>
+                <w:color w:val="BCBEC4"/>
+              </w:rPr>
+              <w:br/>
+            </w:r>
+            <w:r>
+              <w:rPr>
+                <w:color w:val="BCBEC4"/>
+              </w:rPr>
+              <w:br/>
+            </w:r>
+            <w:r>
+              <w:rPr>
+                <w:color w:val="CF8E6D"/>
+              </w:rPr>
+              <w:t>while True</w:t>
+            </w:r>
+            <w:r>
+              <w:rPr>
+                <w:color w:val="BCBEC4"/>
+              </w:rPr>
+              <w:t>:</w:t>
+            </w:r>
+            <w:r>
+              <w:rPr>
+                <w:color w:val="BCBEC4"/>
+              </w:rPr>
+              <w:br/>
+              <w:t xml:space="preserve">    op = </w:t>
+            </w:r>
+            <w:r>
+              <w:rPr>
+                <w:color w:val="8888C6"/>
+              </w:rPr>
+              <w:t>input</w:t>
+            </w:r>
+            <w:r>
+              <w:rPr>
+                <w:color w:val="BCBEC4"/>
+              </w:rPr>
+              <w:t>(</w:t>
+            </w:r>
+            <w:r>
+              <w:rPr>
+                <w:color w:val="6AAB73"/>
+              </w:rPr>
+              <w:t>"</w:t>
+            </w:r>
+            <w:proofErr w:type="spellStart"/>
+            <w:r>
+              <w:rPr>
+                <w:color w:val="6AAB73"/>
+              </w:rPr>
+              <w:t>Введіть</w:t>
+            </w:r>
+            <w:proofErr w:type="spellEnd"/>
+            <w:r>
+              <w:rPr>
+                <w:color w:val="6AAB73"/>
+              </w:rPr>
+              <w:t xml:space="preserve"> </w:t>
+            </w:r>
+            <w:proofErr w:type="spellStart"/>
+            <w:r>
+              <w:rPr>
+                <w:color w:val="6AAB73"/>
+              </w:rPr>
+              <w:t>операцію</w:t>
+            </w:r>
+            <w:proofErr w:type="spellEnd"/>
+            <w:r>
+              <w:rPr>
+                <w:color w:val="6AAB73"/>
+              </w:rPr>
+              <w:t xml:space="preserve"> </w:t>
+            </w:r>
+            <w:r>
+              <w:rPr>
+                <w:color w:val="6AAB73"/>
+                <w:lang w:val="ru-RU"/>
+              </w:rPr>
+              <w:t>(+, -, *, /): "</w:t>
+            </w:r>
+            <w:r>
+              <w:rPr>
+                <w:color w:val="BCBEC4"/>
+                <w:lang w:val="ru-RU"/>
+              </w:rPr>
+              <w:t>)</w:t>
+            </w:r>
+            <w:r>
+              <w:rPr>
+                <w:color w:val="BCBEC4"/>
+                <w:lang w:val="ru-RU"/>
+              </w:rPr>
+              <w:br/>
+            </w:r>
+            <w:r>
+              <w:rPr>
+                <w:color w:val="BCBEC4"/>
+                <w:lang w:val="ru-RU"/>
+              </w:rPr>
+              <w:br/>
+              <w:t xml:space="preserve">    </w:t>
+            </w:r>
+            <w:r>
+              <w:rPr>
+                <w:color w:val="CF8E6D"/>
+              </w:rPr>
+              <w:t>if</w:t>
+            </w:r>
+            <w:r>
+              <w:rPr>
+                <w:color w:val="CF8E6D"/>
+                <w:lang w:val="ru-RU"/>
+              </w:rPr>
+              <w:t xml:space="preserve"> </w:t>
+            </w:r>
+            <w:r>
+              <w:rPr>
+                <w:color w:val="BCBEC4"/>
+              </w:rPr>
+              <w:t>op</w:t>
+            </w:r>
+            <w:r>
+              <w:rPr>
+                <w:color w:val="BCBEC4"/>
+                <w:lang w:val="ru-RU"/>
+              </w:rPr>
+              <w:t xml:space="preserve"> == </w:t>
+            </w:r>
+            <w:r>
+              <w:rPr>
+                <w:color w:val="6AAB73"/>
+                <w:lang w:val="ru-RU"/>
+              </w:rPr>
+              <w:t>'</w:t>
+            </w:r>
+            <w:r>
+              <w:rPr>
+                <w:color w:val="6AAB73"/>
+              </w:rPr>
+              <w:t>q</w:t>
+            </w:r>
+            <w:r>
+              <w:rPr>
+                <w:color w:val="6AAB73"/>
+                <w:lang w:val="ru-RU"/>
+              </w:rPr>
+              <w:t xml:space="preserve">' </w:t>
+            </w:r>
+            <w:r>
+              <w:rPr>
+                <w:color w:val="CF8E6D"/>
+              </w:rPr>
+              <w:t>or</w:t>
+            </w:r>
+            <w:r>
+              <w:rPr>
+                <w:color w:val="CF8E6D"/>
+                <w:lang w:val="ru-RU"/>
+              </w:rPr>
+              <w:t xml:space="preserve"> </w:t>
+            </w:r>
+            <w:r>
+              <w:rPr>
+                <w:color w:val="BCBEC4"/>
+              </w:rPr>
+              <w:t>op</w:t>
+            </w:r>
+            <w:r>
+              <w:rPr>
+                <w:color w:val="BCBEC4"/>
+                <w:lang w:val="ru-RU"/>
+              </w:rPr>
+              <w:t xml:space="preserve"> == </w:t>
+            </w:r>
+            <w:r>
+              <w:rPr>
+                <w:color w:val="6AAB73"/>
+                <w:lang w:val="ru-RU"/>
+              </w:rPr>
+              <w:t>'</w:t>
+            </w:r>
+            <w:r>
+              <w:rPr>
+                <w:color w:val="6AAB73"/>
+              </w:rPr>
+              <w:t>exit</w:t>
+            </w:r>
+            <w:r>
+              <w:rPr>
+                <w:color w:val="6AAB73"/>
+                <w:lang w:val="ru-RU"/>
+              </w:rPr>
+              <w:t>'</w:t>
+            </w:r>
+            <w:r>
+              <w:rPr>
+                <w:color w:val="BCBEC4"/>
+                <w:lang w:val="ru-RU"/>
+              </w:rPr>
+              <w:t>:</w:t>
+            </w:r>
+            <w:r>
+              <w:rPr>
+                <w:color w:val="BCBEC4"/>
+                <w:lang w:val="ru-RU"/>
+              </w:rPr>
+              <w:br/>
+              <w:t xml:space="preserve">        </w:t>
+            </w:r>
+            <w:r>
+              <w:rPr>
+                <w:color w:val="8888C6"/>
+              </w:rPr>
+              <w:t>print</w:t>
+            </w:r>
+            <w:r>
+              <w:rPr>
+                <w:color w:val="BCBEC4"/>
+                <w:lang w:val="ru-RU"/>
+              </w:rPr>
+              <w:t>(</w:t>
+            </w:r>
+            <w:r>
+              <w:rPr>
+                <w:color w:val="6AAB73"/>
+                <w:lang w:val="ru-RU"/>
+              </w:rPr>
+              <w:t>"</w:t>
+            </w:r>
+            <w:proofErr w:type="spellStart"/>
+            <w:r>
+              <w:rPr>
+                <w:color w:val="6AAB73"/>
+                <w:lang w:val="ru-RU"/>
+              </w:rPr>
+              <w:t>Програма</w:t>
+            </w:r>
+            <w:proofErr w:type="spellEnd"/>
+            <w:r>
+              <w:rPr>
+                <w:color w:val="6AAB73"/>
+                <w:lang w:val="ru-RU"/>
+              </w:rPr>
+              <w:t xml:space="preserve"> завершена. До </w:t>
+            </w:r>
+            <w:proofErr w:type="spellStart"/>
+            <w:r>
+              <w:rPr>
+                <w:color w:val="6AAB73"/>
+                <w:lang w:val="ru-RU"/>
+              </w:rPr>
+              <w:t>побачення</w:t>
+            </w:r>
+            <w:proofErr w:type="spellEnd"/>
+            <w:r>
+              <w:rPr>
+                <w:color w:val="6AAB73"/>
+                <w:lang w:val="ru-RU"/>
+              </w:rPr>
+              <w:t>!"</w:t>
+            </w:r>
+            <w:r>
+              <w:rPr>
+                <w:color w:val="BCBEC4"/>
+                <w:lang w:val="ru-RU"/>
+              </w:rPr>
+              <w:t>)</w:t>
+            </w:r>
+            <w:r>
+              <w:rPr>
+                <w:color w:val="BCBEC4"/>
+                <w:lang w:val="ru-RU"/>
+              </w:rPr>
+              <w:br/>
+              <w:t xml:space="preserve">        </w:t>
+            </w:r>
+            <w:r>
+              <w:rPr>
+                <w:color w:val="CF8E6D"/>
+              </w:rPr>
+              <w:t>break</w:t>
+            </w:r>
+            <w:r>
+              <w:rPr>
+                <w:color w:val="CF8E6D"/>
+                <w:lang w:val="ru-RU"/>
+              </w:rPr>
+              <w:br/>
+              <w:t xml:space="preserve">    </w:t>
+            </w:r>
+            <w:r>
+              <w:rPr>
+                <w:color w:val="CF8E6D"/>
+              </w:rPr>
+              <w:t>if</w:t>
+            </w:r>
+            <w:r>
+              <w:rPr>
+                <w:color w:val="CF8E6D"/>
+                <w:lang w:val="ru-RU"/>
+              </w:rPr>
+              <w:t xml:space="preserve"> </w:t>
+            </w:r>
+            <w:r>
+              <w:rPr>
+                <w:color w:val="BCBEC4"/>
+              </w:rPr>
+              <w:t>op</w:t>
+            </w:r>
+            <w:r>
+              <w:rPr>
+                <w:color w:val="BCBEC4"/>
+                <w:lang w:val="ru-RU"/>
+              </w:rPr>
+              <w:t xml:space="preserve"> </w:t>
+            </w:r>
+            <w:r>
+              <w:rPr>
+                <w:color w:val="CF8E6D"/>
+              </w:rPr>
+              <w:t>not</w:t>
+            </w:r>
+            <w:r>
+              <w:rPr>
+                <w:color w:val="CF8E6D"/>
+                <w:lang w:val="ru-RU"/>
+              </w:rPr>
+              <w:t xml:space="preserve"> </w:t>
+            </w:r>
+            <w:r>
+              <w:rPr>
+                <w:color w:val="CF8E6D"/>
+              </w:rPr>
+              <w:t>in</w:t>
+            </w:r>
+            <w:r>
+              <w:rPr>
+                <w:color w:val="CF8E6D"/>
+                <w:lang w:val="ru-RU"/>
+              </w:rPr>
+              <w:t xml:space="preserve"> </w:t>
+            </w:r>
+            <w:r>
+              <w:rPr>
+                <w:color w:val="BCBEC4"/>
+                <w:lang w:val="ru-RU"/>
+              </w:rPr>
+              <w:t>[</w:t>
+            </w:r>
+            <w:r>
+              <w:rPr>
+                <w:color w:val="6AAB73"/>
+                <w:lang w:val="ru-RU"/>
+              </w:rPr>
+              <w:t>'+'</w:t>
+            </w:r>
+            <w:r>
+              <w:rPr>
+                <w:color w:val="BCBEC4"/>
+                <w:lang w:val="ru-RU"/>
+              </w:rPr>
+              <w:t xml:space="preserve">, </w:t>
+            </w:r>
+            <w:r>
+              <w:rPr>
+                <w:color w:val="6AAB73"/>
+                <w:lang w:val="ru-RU"/>
+              </w:rPr>
+              <w:t>'-'</w:t>
+            </w:r>
+            <w:r>
+              <w:rPr>
+                <w:color w:val="BCBEC4"/>
+                <w:lang w:val="ru-RU"/>
+              </w:rPr>
+              <w:t xml:space="preserve">, </w:t>
+            </w:r>
+            <w:r>
+              <w:rPr>
+                <w:color w:val="6AAB73"/>
+                <w:lang w:val="ru-RU"/>
+              </w:rPr>
+              <w:t>'*'</w:t>
+            </w:r>
+            <w:r>
+              <w:rPr>
+                <w:color w:val="BCBEC4"/>
+                <w:lang w:val="ru-RU"/>
+              </w:rPr>
+              <w:t xml:space="preserve">, </w:t>
+            </w:r>
+            <w:r>
+              <w:rPr>
+                <w:color w:val="6AAB73"/>
+                <w:lang w:val="ru-RU"/>
+              </w:rPr>
+              <w:t>'/'</w:t>
+            </w:r>
+            <w:r>
+              <w:rPr>
+                <w:color w:val="BCBEC4"/>
+                <w:lang w:val="ru-RU"/>
+              </w:rPr>
+              <w:t>]:</w:t>
+            </w:r>
+            <w:r>
+              <w:rPr>
+                <w:color w:val="BCBEC4"/>
+                <w:lang w:val="ru-RU"/>
+              </w:rPr>
+              <w:br/>
+              <w:t xml:space="preserve">        </w:t>
+            </w:r>
+            <w:r>
+              <w:rPr>
+                <w:color w:val="8888C6"/>
+              </w:rPr>
+              <w:t>print</w:t>
+            </w:r>
+            <w:r>
+              <w:rPr>
+                <w:color w:val="BCBEC4"/>
+                <w:lang w:val="ru-RU"/>
+              </w:rPr>
+              <w:t>(</w:t>
+            </w:r>
+            <w:r>
+              <w:rPr>
+                <w:color w:val="6AAB73"/>
+                <w:lang w:val="ru-RU"/>
+              </w:rPr>
+              <w:t>"</w:t>
+            </w:r>
+            <w:proofErr w:type="spellStart"/>
+            <w:r>
+              <w:rPr>
+                <w:color w:val="6AAB73"/>
+                <w:lang w:val="ru-RU"/>
+              </w:rPr>
+              <w:t>Невідома</w:t>
+            </w:r>
+            <w:proofErr w:type="spellEnd"/>
+            <w:r>
+              <w:rPr>
+                <w:color w:val="6AAB73"/>
+                <w:lang w:val="ru-RU"/>
+              </w:rPr>
+              <w:t xml:space="preserve"> </w:t>
+            </w:r>
+            <w:proofErr w:type="spellStart"/>
+            <w:r>
+              <w:rPr>
+                <w:color w:val="6AAB73"/>
+                <w:lang w:val="ru-RU"/>
+              </w:rPr>
+              <w:t>операція</w:t>
+            </w:r>
+            <w:proofErr w:type="spellEnd"/>
+            <w:r>
+              <w:rPr>
+                <w:color w:val="6AAB73"/>
+                <w:lang w:val="ru-RU"/>
+              </w:rPr>
+              <w:t xml:space="preserve">, </w:t>
+            </w:r>
+            <w:proofErr w:type="spellStart"/>
+            <w:r>
+              <w:rPr>
+                <w:color w:val="6AAB73"/>
+                <w:lang w:val="ru-RU"/>
+              </w:rPr>
+              <w:t>спробуйте</w:t>
+            </w:r>
+            <w:proofErr w:type="spellEnd"/>
+            <w:r>
+              <w:rPr>
+                <w:color w:val="6AAB73"/>
+                <w:lang w:val="ru-RU"/>
+              </w:rPr>
+              <w:t xml:space="preserve"> </w:t>
+            </w:r>
+            <w:proofErr w:type="spellStart"/>
+            <w:r>
+              <w:rPr>
+                <w:color w:val="6AAB73"/>
+                <w:lang w:val="ru-RU"/>
+              </w:rPr>
+              <w:t>ще</w:t>
+            </w:r>
+            <w:proofErr w:type="spellEnd"/>
+            <w:r>
+              <w:rPr>
+                <w:color w:val="6AAB73"/>
+                <w:lang w:val="ru-RU"/>
+              </w:rPr>
+              <w:t xml:space="preserve"> раз.</w:t>
+            </w:r>
+            <w:r>
+              <w:rPr>
+                <w:color w:val="CF8E6D"/>
+                <w:lang w:val="ru-RU"/>
+              </w:rPr>
+              <w:t>\</w:t>
+            </w:r>
+            <w:r>
+              <w:rPr>
+                <w:color w:val="CF8E6D"/>
+              </w:rPr>
+              <w:t>n</w:t>
+            </w:r>
+            <w:r>
+              <w:rPr>
+                <w:color w:val="6AAB73"/>
+                <w:lang w:val="ru-RU"/>
+              </w:rPr>
+              <w:t>"</w:t>
+            </w:r>
+            <w:r>
+              <w:rPr>
+                <w:color w:val="BCBEC4"/>
+                <w:lang w:val="ru-RU"/>
+              </w:rPr>
+              <w:t>)</w:t>
+            </w:r>
+            <w:r>
+              <w:rPr>
+                <w:color w:val="BCBEC4"/>
+                <w:lang w:val="ru-RU"/>
+              </w:rPr>
+              <w:br/>
+              <w:t xml:space="preserve">        </w:t>
+            </w:r>
+            <w:r>
+              <w:rPr>
+                <w:color w:val="CF8E6D"/>
+              </w:rPr>
+              <w:t>continue</w:t>
+            </w:r>
+            <w:r>
+              <w:rPr>
+                <w:color w:val="CF8E6D"/>
+                <w:lang w:val="ru-RU"/>
+              </w:rPr>
+              <w:br/>
+            </w:r>
+            <w:r>
+              <w:rPr>
+                <w:color w:val="CF8E6D"/>
+                <w:lang w:val="ru-RU"/>
+              </w:rPr>
+              <w:br/>
+              <w:t xml:space="preserve">    </w:t>
+            </w:r>
+            <w:r>
+              <w:rPr>
+                <w:color w:val="BCBEC4"/>
+              </w:rPr>
+              <w:t>a</w:t>
+            </w:r>
+            <w:r>
+              <w:rPr>
+                <w:color w:val="BCBEC4"/>
+                <w:lang w:val="ru-RU"/>
+              </w:rPr>
+              <w:t xml:space="preserve"> = </w:t>
+            </w:r>
+            <w:r>
+              <w:rPr>
+                <w:color w:val="BCBEC4"/>
+              </w:rPr>
+              <w:t>get</w:t>
+            </w:r>
+            <w:r>
+              <w:rPr>
+                <w:color w:val="BCBEC4"/>
+                <w:lang w:val="ru-RU"/>
+              </w:rPr>
+              <w:t>_</w:t>
+            </w:r>
+            <w:r>
+              <w:rPr>
+                <w:color w:val="BCBEC4"/>
+              </w:rPr>
+              <w:t>number</w:t>
+            </w:r>
+            <w:r>
+              <w:rPr>
+                <w:color w:val="BCBEC4"/>
+                <w:lang w:val="ru-RU"/>
+              </w:rPr>
+              <w:t>(</w:t>
+            </w:r>
+            <w:r>
+              <w:rPr>
+                <w:color w:val="6AAB73"/>
+                <w:lang w:val="ru-RU"/>
+              </w:rPr>
+              <w:t>"</w:t>
+            </w:r>
+            <w:proofErr w:type="spellStart"/>
+            <w:r>
+              <w:rPr>
+                <w:color w:val="6AAB73"/>
+                <w:lang w:val="ru-RU"/>
+              </w:rPr>
+              <w:t>Введіть</w:t>
+            </w:r>
+            <w:proofErr w:type="spellEnd"/>
+            <w:r>
+              <w:rPr>
+                <w:color w:val="6AAB73"/>
+                <w:lang w:val="ru-RU"/>
+              </w:rPr>
+              <w:t xml:space="preserve"> перше число: "</w:t>
+            </w:r>
+            <w:r>
+              <w:rPr>
+                <w:color w:val="BCBEC4"/>
+                <w:lang w:val="ru-RU"/>
+              </w:rPr>
+              <w:t>)</w:t>
+            </w:r>
+            <w:r>
+              <w:rPr>
+                <w:color w:val="BCBEC4"/>
+                <w:lang w:val="ru-RU"/>
+              </w:rPr>
+              <w:br/>
+              <w:t xml:space="preserve">    </w:t>
+            </w:r>
+            <w:r>
+              <w:rPr>
+                <w:color w:val="BCBEC4"/>
+              </w:rPr>
+              <w:t>b</w:t>
+            </w:r>
+            <w:r>
+              <w:rPr>
+                <w:color w:val="BCBEC4"/>
+                <w:lang w:val="ru-RU"/>
+              </w:rPr>
+              <w:t xml:space="preserve"> = </w:t>
+            </w:r>
+            <w:r>
+              <w:rPr>
+                <w:color w:val="BCBEC4"/>
+              </w:rPr>
+              <w:t>get</w:t>
+            </w:r>
+            <w:r>
+              <w:rPr>
+                <w:color w:val="BCBEC4"/>
+                <w:lang w:val="ru-RU"/>
+              </w:rPr>
+              <w:t>_</w:t>
+            </w:r>
+            <w:r>
+              <w:rPr>
+                <w:color w:val="BCBEC4"/>
+              </w:rPr>
+              <w:t>number</w:t>
+            </w:r>
+            <w:r>
+              <w:rPr>
+                <w:color w:val="BCBEC4"/>
+                <w:lang w:val="ru-RU"/>
+              </w:rPr>
+              <w:t>(</w:t>
+            </w:r>
+            <w:r>
+              <w:rPr>
+                <w:color w:val="6AAB73"/>
+                <w:lang w:val="ru-RU"/>
+              </w:rPr>
+              <w:t>"</w:t>
+            </w:r>
+            <w:proofErr w:type="spellStart"/>
+            <w:r>
+              <w:rPr>
+                <w:color w:val="6AAB73"/>
+                <w:lang w:val="ru-RU"/>
+              </w:rPr>
+              <w:t>Введіть</w:t>
+            </w:r>
+            <w:proofErr w:type="spellEnd"/>
+            <w:r>
+              <w:rPr>
+                <w:color w:val="6AAB73"/>
+                <w:lang w:val="ru-RU"/>
+              </w:rPr>
+              <w:t xml:space="preserve"> друге число: "</w:t>
+            </w:r>
+            <w:r>
+              <w:rPr>
+                <w:color w:val="BCBEC4"/>
+                <w:lang w:val="ru-RU"/>
+              </w:rPr>
+              <w:t>)</w:t>
+            </w:r>
+            <w:r>
+              <w:rPr>
+                <w:color w:val="BCBEC4"/>
+                <w:lang w:val="ru-RU"/>
+              </w:rPr>
+              <w:br/>
+            </w:r>
+            <w:r>
+              <w:rPr>
+                <w:color w:val="BCBEC4"/>
+                <w:lang w:val="ru-RU"/>
+              </w:rPr>
+              <w:br/>
+              <w:t xml:space="preserve">    </w:t>
+            </w:r>
+            <w:r>
+              <w:rPr>
+                <w:color w:val="CF8E6D"/>
+              </w:rPr>
+              <w:t>match</w:t>
+            </w:r>
+            <w:r>
+              <w:rPr>
+                <w:color w:val="CF8E6D"/>
+                <w:lang w:val="ru-RU"/>
+              </w:rPr>
+              <w:t xml:space="preserve"> </w:t>
+            </w:r>
+            <w:r>
+              <w:rPr>
+                <w:color w:val="BCBEC4"/>
+              </w:rPr>
+              <w:t>op</w:t>
+            </w:r>
+            <w:r>
+              <w:rPr>
+                <w:color w:val="BCBEC4"/>
+                <w:lang w:val="ru-RU"/>
+              </w:rPr>
+              <w:t>:</w:t>
+            </w:r>
+            <w:r>
+              <w:rPr>
+                <w:color w:val="BCBEC4"/>
+                <w:lang w:val="ru-RU"/>
+              </w:rPr>
+              <w:br/>
+              <w:t xml:space="preserve">        </w:t>
+            </w:r>
+            <w:r>
+              <w:rPr>
+                <w:color w:val="CF8E6D"/>
+              </w:rPr>
+              <w:t>case</w:t>
+            </w:r>
+            <w:r>
+              <w:rPr>
+                <w:color w:val="CF8E6D"/>
+                <w:lang w:val="ru-RU"/>
+              </w:rPr>
+              <w:t xml:space="preserve"> </w:t>
+            </w:r>
+            <w:r>
+              <w:rPr>
+                <w:color w:val="6AAB73"/>
+                <w:lang w:val="ru-RU"/>
+              </w:rPr>
+              <w:t>'+'</w:t>
+            </w:r>
+            <w:r>
+              <w:rPr>
+                <w:color w:val="BCBEC4"/>
+                <w:lang w:val="ru-RU"/>
+              </w:rPr>
+              <w:t>:</w:t>
+            </w:r>
+            <w:r>
+              <w:rPr>
+                <w:color w:val="BCBEC4"/>
+                <w:lang w:val="ru-RU"/>
+              </w:rPr>
+              <w:br/>
+              <w:t xml:space="preserve">            </w:t>
+            </w:r>
+            <w:r>
+              <w:rPr>
+                <w:color w:val="BCBEC4"/>
+              </w:rPr>
+              <w:t>res</w:t>
+            </w:r>
+            <w:r>
+              <w:rPr>
+                <w:color w:val="BCBEC4"/>
+                <w:lang w:val="ru-RU"/>
+              </w:rPr>
+              <w:t xml:space="preserve"> = </w:t>
+            </w:r>
+            <w:r>
+              <w:rPr>
+                <w:color w:val="BCBEC4"/>
+              </w:rPr>
+              <w:t>add</w:t>
+            </w:r>
+            <w:r>
+              <w:rPr>
+                <w:color w:val="BCBEC4"/>
+                <w:lang w:val="ru-RU"/>
+              </w:rPr>
+              <w:t>(</w:t>
+            </w:r>
+            <w:r>
+              <w:rPr>
+                <w:color w:val="BCBEC4"/>
+              </w:rPr>
+              <w:t>a</w:t>
+            </w:r>
+            <w:r>
+              <w:rPr>
+                <w:color w:val="BCBEC4"/>
+                <w:lang w:val="ru-RU"/>
+              </w:rPr>
+              <w:t xml:space="preserve">, </w:t>
+            </w:r>
+            <w:r>
+              <w:rPr>
+                <w:color w:val="BCBEC4"/>
+              </w:rPr>
+              <w:t>b</w:t>
+            </w:r>
+            <w:r>
+              <w:rPr>
+                <w:color w:val="BCBEC4"/>
+                <w:lang w:val="ru-RU"/>
+              </w:rPr>
+              <w:t>)</w:t>
+            </w:r>
+            <w:r>
+              <w:rPr>
+                <w:color w:val="BCBEC4"/>
+                <w:lang w:val="ru-RU"/>
+              </w:rPr>
+              <w:br/>
+              <w:t xml:space="preserve">        </w:t>
+            </w:r>
+            <w:r>
+              <w:rPr>
+                <w:color w:val="CF8E6D"/>
+              </w:rPr>
+              <w:t>case</w:t>
+            </w:r>
+            <w:r>
+              <w:rPr>
+                <w:color w:val="CF8E6D"/>
+                <w:lang w:val="ru-RU"/>
+              </w:rPr>
+              <w:t xml:space="preserve"> </w:t>
+            </w:r>
+            <w:r>
+              <w:rPr>
+                <w:color w:val="6AAB73"/>
+                <w:lang w:val="ru-RU"/>
+              </w:rPr>
+              <w:t>'-'</w:t>
+            </w:r>
+            <w:r>
+              <w:rPr>
+                <w:color w:val="BCBEC4"/>
+                <w:lang w:val="ru-RU"/>
+              </w:rPr>
+              <w:t>:</w:t>
+            </w:r>
+            <w:r>
+              <w:rPr>
+                <w:color w:val="BCBEC4"/>
+                <w:lang w:val="ru-RU"/>
+              </w:rPr>
+              <w:br/>
+              <w:t xml:space="preserve">            </w:t>
+            </w:r>
+            <w:r>
+              <w:rPr>
+                <w:color w:val="BCBEC4"/>
+              </w:rPr>
+              <w:t>res</w:t>
+            </w:r>
+            <w:r>
+              <w:rPr>
+                <w:color w:val="BCBEC4"/>
+                <w:lang w:val="ru-RU"/>
+              </w:rPr>
+              <w:t xml:space="preserve"> = </w:t>
+            </w:r>
+            <w:r>
+              <w:rPr>
+                <w:color w:val="BCBEC4"/>
+              </w:rPr>
+              <w:t>sub</w:t>
+            </w:r>
+            <w:r>
+              <w:rPr>
+                <w:color w:val="BCBEC4"/>
+                <w:lang w:val="ru-RU"/>
+              </w:rPr>
+              <w:t>(</w:t>
+            </w:r>
+            <w:r>
+              <w:rPr>
+                <w:color w:val="BCBEC4"/>
+              </w:rPr>
+              <w:t>a</w:t>
+            </w:r>
+            <w:r>
+              <w:rPr>
+                <w:color w:val="BCBEC4"/>
+                <w:lang w:val="ru-RU"/>
+              </w:rPr>
+              <w:t xml:space="preserve">, </w:t>
+            </w:r>
+            <w:r>
+              <w:rPr>
+                <w:color w:val="BCBEC4"/>
+              </w:rPr>
+              <w:t>b</w:t>
+            </w:r>
+            <w:r>
+              <w:rPr>
+                <w:color w:val="BCBEC4"/>
+                <w:lang w:val="ru-RU"/>
+              </w:rPr>
+              <w:t>)</w:t>
+            </w:r>
+            <w:r>
+              <w:rPr>
+                <w:color w:val="BCBEC4"/>
+                <w:lang w:val="ru-RU"/>
+              </w:rPr>
+              <w:br/>
+              <w:t xml:space="preserve">        </w:t>
+            </w:r>
+            <w:r>
+              <w:rPr>
+                <w:color w:val="CF8E6D"/>
+              </w:rPr>
+              <w:t>case</w:t>
+            </w:r>
+            <w:r>
+              <w:rPr>
+                <w:color w:val="CF8E6D"/>
+                <w:lang w:val="ru-RU"/>
+              </w:rPr>
+              <w:t xml:space="preserve"> </w:t>
+            </w:r>
+            <w:r>
+              <w:rPr>
+                <w:color w:val="6AAB73"/>
+                <w:lang w:val="ru-RU"/>
+              </w:rPr>
+              <w:t>'*'</w:t>
+            </w:r>
+            <w:r>
+              <w:rPr>
+                <w:color w:val="BCBEC4"/>
+                <w:lang w:val="ru-RU"/>
+              </w:rPr>
+              <w:t>:</w:t>
+            </w:r>
+            <w:r>
+              <w:rPr>
+                <w:color w:val="BCBEC4"/>
+                <w:lang w:val="ru-RU"/>
+              </w:rPr>
+              <w:br/>
+              <w:t xml:space="preserve">            </w:t>
+            </w:r>
+            <w:r>
+              <w:rPr>
+                <w:color w:val="BCBEC4"/>
+              </w:rPr>
+              <w:t>res</w:t>
+            </w:r>
+            <w:r>
+              <w:rPr>
+                <w:color w:val="BCBEC4"/>
+                <w:lang w:val="ru-RU"/>
+              </w:rPr>
+              <w:t xml:space="preserve"> = </w:t>
+            </w:r>
+            <w:proofErr w:type="spellStart"/>
+            <w:r>
+              <w:rPr>
+                <w:color w:val="BCBEC4"/>
+              </w:rPr>
+              <w:t>mult</w:t>
+            </w:r>
+            <w:proofErr w:type="spellEnd"/>
+            <w:r>
+              <w:rPr>
+                <w:color w:val="BCBEC4"/>
+                <w:lang w:val="ru-RU"/>
+              </w:rPr>
+              <w:t>(</w:t>
+            </w:r>
+            <w:r>
+              <w:rPr>
+                <w:color w:val="BCBEC4"/>
+              </w:rPr>
+              <w:t>a</w:t>
+            </w:r>
+            <w:r>
+              <w:rPr>
+                <w:color w:val="BCBEC4"/>
+                <w:lang w:val="ru-RU"/>
+              </w:rPr>
+              <w:t xml:space="preserve">, </w:t>
+            </w:r>
+            <w:r>
+              <w:rPr>
+                <w:color w:val="BCBEC4"/>
+              </w:rPr>
+              <w:t>b</w:t>
+            </w:r>
+            <w:r>
+              <w:rPr>
+                <w:color w:val="BCBEC4"/>
+                <w:lang w:val="ru-RU"/>
+              </w:rPr>
+              <w:t>)</w:t>
+            </w:r>
+            <w:r>
+              <w:rPr>
+                <w:color w:val="BCBEC4"/>
+                <w:lang w:val="ru-RU"/>
+              </w:rPr>
+              <w:br/>
+              <w:t xml:space="preserve">        </w:t>
+            </w:r>
+            <w:r>
+              <w:rPr>
+                <w:color w:val="CF8E6D"/>
+              </w:rPr>
+              <w:t>case</w:t>
+            </w:r>
+            <w:r>
+              <w:rPr>
+                <w:color w:val="CF8E6D"/>
+                <w:lang w:val="ru-RU"/>
+              </w:rPr>
+              <w:t xml:space="preserve"> </w:t>
+            </w:r>
+            <w:r>
+              <w:rPr>
+                <w:color w:val="6AAB73"/>
+                <w:lang w:val="ru-RU"/>
+              </w:rPr>
+              <w:t>'/'</w:t>
+            </w:r>
+            <w:r>
+              <w:rPr>
+                <w:color w:val="BCBEC4"/>
+                <w:lang w:val="ru-RU"/>
+              </w:rPr>
+              <w:t>:</w:t>
+            </w:r>
+            <w:r>
+              <w:rPr>
+                <w:color w:val="BCBEC4"/>
+                <w:lang w:val="ru-RU"/>
+              </w:rPr>
+              <w:br/>
+              <w:t xml:space="preserve">            </w:t>
+            </w:r>
+            <w:r>
+              <w:rPr>
+                <w:color w:val="BCBEC4"/>
+              </w:rPr>
+              <w:t>res</w:t>
+            </w:r>
+            <w:r>
+              <w:rPr>
+                <w:color w:val="BCBEC4"/>
+                <w:lang w:val="ru-RU"/>
+              </w:rPr>
+              <w:t xml:space="preserve"> = </w:t>
+            </w:r>
+            <w:r>
+              <w:rPr>
+                <w:color w:val="BCBEC4"/>
+              </w:rPr>
+              <w:t>div</w:t>
+            </w:r>
+            <w:r>
+              <w:rPr>
+                <w:color w:val="BCBEC4"/>
+                <w:lang w:val="ru-RU"/>
+              </w:rPr>
+              <w:t>(</w:t>
+            </w:r>
+            <w:r>
+              <w:rPr>
+                <w:color w:val="BCBEC4"/>
+              </w:rPr>
+              <w:t>a</w:t>
+            </w:r>
+            <w:r>
+              <w:rPr>
+                <w:color w:val="BCBEC4"/>
+                <w:lang w:val="ru-RU"/>
+              </w:rPr>
+              <w:t xml:space="preserve">, </w:t>
+            </w:r>
+            <w:r>
+              <w:rPr>
+                <w:color w:val="BCBEC4"/>
+              </w:rPr>
+              <w:t>b</w:t>
+            </w:r>
+            <w:r>
+              <w:rPr>
+                <w:color w:val="BCBEC4"/>
+                <w:lang w:val="ru-RU"/>
+              </w:rPr>
+              <w:t>)</w:t>
+            </w:r>
+            <w:r>
+              <w:rPr>
+                <w:color w:val="BCBEC4"/>
+                <w:lang w:val="ru-RU"/>
+              </w:rPr>
+              <w:br/>
+            </w:r>
+            <w:r>
+              <w:rPr>
+                <w:color w:val="BCBEC4"/>
+                <w:lang w:val="ru-RU"/>
+              </w:rPr>
+              <w:br/>
+              <w:t xml:space="preserve">    </w:t>
+            </w:r>
+            <w:r>
+              <w:rPr>
+                <w:color w:val="8888C6"/>
+              </w:rPr>
+              <w:t>print</w:t>
+            </w:r>
+            <w:r>
+              <w:rPr>
+                <w:color w:val="BCBEC4"/>
+                <w:lang w:val="ru-RU"/>
+              </w:rPr>
+              <w:t>(</w:t>
+            </w:r>
+            <w:r>
+              <w:rPr>
+                <w:color w:val="6AAB73"/>
+              </w:rPr>
+              <w:t>f</w:t>
+            </w:r>
+            <w:r>
+              <w:rPr>
+                <w:color w:val="6AAB73"/>
+                <w:lang w:val="ru-RU"/>
+              </w:rPr>
+              <w:t xml:space="preserve">"Результат: </w:t>
+            </w:r>
+            <w:r>
+              <w:rPr>
+                <w:color w:val="CF8E6D"/>
+                <w:lang w:val="ru-RU"/>
+              </w:rPr>
+              <w:t>{</w:t>
+            </w:r>
+            <w:r>
+              <w:rPr>
+                <w:color w:val="BCBEC4"/>
+              </w:rPr>
+              <w:t>res</w:t>
+            </w:r>
+            <w:r>
+              <w:rPr>
+                <w:color w:val="CF8E6D"/>
+                <w:lang w:val="ru-RU"/>
+              </w:rPr>
+              <w:t>}\</w:t>
+            </w:r>
+            <w:r>
+              <w:rPr>
+                <w:color w:val="CF8E6D"/>
+              </w:rPr>
+              <w:t>n</w:t>
+            </w:r>
+            <w:r>
+              <w:rPr>
+                <w:color w:val="6AAB73"/>
+                <w:lang w:val="ru-RU"/>
+              </w:rPr>
+              <w:t>"</w:t>
+            </w:r>
+            <w:r>
+              <w:rPr>
+                <w:color w:val="BCBEC4"/>
+                <w:lang w:val="ru-RU"/>
+              </w:rPr>
+              <w:t>)</w:t>
+            </w:r>
+          </w:p>
+        </w:tc>
+      </w:tr>
+    </w:tbl>
+    <w:p>
+      <w:pPr>
+        <w:pStyle w:val="a5"/>
+        <w:spacing w:line="360" w:lineRule="auto"/>
+        <w:rPr>
+          <w:sz w:val="28"/>
+          <w:szCs w:val="28"/>
+          <w:lang w:val="ru-UA"/>
+        </w:rPr>
+      </w:pPr>
+      <w:bookmarkStart w:id="0" w:name="_GoBack"/>
+      <w:bookmarkEnd w:id="0"/>
+    </w:p>
+    <w:p>
+      <w:pPr>
+        <w:pStyle w:val="a5"/>
+        <w:numPr>
+          <w:ilvl w:val="0"/>
+          <w:numId w:val="16"/>
+        </w:numPr>
+        <w:spacing w:line="360" w:lineRule="auto"/>
+        <w:ind w:firstLine="567"/>
+        <w:rPr>
+          <w:sz w:val="28"/>
+          <w:szCs w:val="28"/>
+          <w:lang w:val="ru-UA"/>
+        </w:rPr>
+      </w:pPr>
+      <w:r>
+        <w:rPr>
+          <w:sz w:val="28"/>
+          <w:szCs w:val="28"/>
+          <w:lang w:val="ru-UA"/>
+        </w:rPr>
+        <w:t xml:space="preserve">Створені файли додано до системи контролю версій Git командою </w:t>
+      </w:r>
+      <w:r>
+        <w:rPr>
+          <w:rStyle w:val="HTML"/>
+          <w:rFonts w:ascii="Times New Roman" w:hAnsi="Times New Roman" w:cs="Times New Roman"/>
+          <w:sz w:val="28"/>
+          <w:szCs w:val="28"/>
+          <w:lang w:val="ru-UA"/>
+        </w:rPr>
+        <w:t>git add .</w:t>
+      </w:r>
+      <w:r>
+        <w:rPr>
+          <w:sz w:val="28"/>
+          <w:szCs w:val="28"/>
+          <w:lang w:val="ru-UA"/>
+        </w:rPr>
+        <w:t xml:space="preserve"> та зафіксовано комітом </w:t>
+      </w:r>
+      <w:r>
+        <w:rPr>
+          <w:rStyle w:val="HTML"/>
+          <w:rFonts w:ascii="Times New Roman" w:hAnsi="Times New Roman" w:cs="Times New Roman"/>
+          <w:sz w:val="28"/>
+          <w:szCs w:val="28"/>
+          <w:lang w:val="ru-UA"/>
+        </w:rPr>
+        <w:t>git commit -m "add task for topic 04"</w:t>
+      </w:r>
+      <w:r>
+        <w:rPr>
+          <w:sz w:val="28"/>
+          <w:szCs w:val="28"/>
+          <w:lang w:val="ru-UA"/>
+        </w:rPr>
+        <w:t xml:space="preserve">. Зміни відправлено до віддаленого репозиторію за допомогою команди </w:t>
+      </w:r>
+      <w:r>
+        <w:rPr>
+          <w:rStyle w:val="HTML"/>
+          <w:rFonts w:ascii="Times New Roman" w:hAnsi="Times New Roman" w:cs="Times New Roman"/>
+          <w:sz w:val="28"/>
+          <w:szCs w:val="28"/>
+          <w:lang w:val="ru-UA"/>
+        </w:rPr>
+        <w:t>git push</w:t>
+      </w:r>
+      <w:r>
+        <w:rPr>
+          <w:sz w:val="28"/>
+          <w:szCs w:val="28"/>
+          <w:lang w:val="ru-UA"/>
+        </w:rPr>
+        <w:t>.</w:t>
+      </w:r>
+    </w:p>
+    <w:p>
+      <w:pPr>
+        <w:pStyle w:val="a5"/>
+        <w:numPr>
+          <w:ilvl w:val="0"/>
+          <w:numId w:val="16"/>
+        </w:numPr>
+        <w:spacing w:line="360" w:lineRule="auto"/>
+        <w:ind w:firstLine="567"/>
+        <w:rPr>
+          <w:sz w:val="28"/>
+          <w:szCs w:val="28"/>
+          <w:lang w:val="ru-UA"/>
+        </w:rPr>
+      </w:pPr>
+      <w:r>
+        <w:rPr>
+          <w:sz w:val="28"/>
+          <w:szCs w:val="28"/>
+          <w:lang w:val="ru-UA"/>
+        </w:rPr>
+        <w:t>Оновлено загальний файл звіту (TP-KB-251-NikolayenkoDmytro-lpr.docx) та відправлено на GitHub окремим комітом з повідомленням "update report".</w:t>
+      </w:r>
+    </w:p>
+    <w:p>
+      <w:pPr>
+        <w:pStyle w:val="a5"/>
+        <w:spacing w:line="360" w:lineRule="auto"/>
+        <w:ind w:firstLine="567"/>
+        <w:rPr>
+          <w:sz w:val="28"/>
+          <w:szCs w:val="28"/>
+          <w:lang w:val="ru-UA"/>
+        </w:rPr>
+      </w:pPr>
+      <w:r>
+        <w:rPr>
+          <w:sz w:val="28"/>
+          <w:szCs w:val="28"/>
+          <w:lang w:val="ru-UA"/>
+        </w:rPr>
+        <w:t>Висновок:</w:t>
+      </w:r>
+    </w:p>
+    <w:p>
+      <w:pPr>
+        <w:pStyle w:val="a5"/>
+        <w:spacing w:line="360" w:lineRule="auto"/>
+        <w:ind w:firstLine="567"/>
+        <w:rPr>
+          <w:sz w:val="28"/>
+          <w:szCs w:val="28"/>
+          <w:lang w:val="ru-UA"/>
+        </w:rPr>
+      </w:pPr>
+      <w:r>
+        <w:rPr>
+          <w:sz w:val="28"/>
+          <w:szCs w:val="28"/>
+          <w:lang w:val="ru-UA"/>
+        </w:rPr>
+        <w:t xml:space="preserve">Під час виконання практичних завдань до Теми 04 я ознайомився з механізмом обробки виняткових ситуацій у мові Python. Я навчився застосовувати блоки </w:t>
+      </w:r>
+      <w:r>
+        <w:rPr>
+          <w:rStyle w:val="HTML"/>
+          <w:rFonts w:ascii="Times New Roman" w:hAnsi="Times New Roman" w:cs="Times New Roman"/>
+          <w:sz w:val="28"/>
+          <w:szCs w:val="28"/>
+          <w:lang w:val="ru-UA"/>
+        </w:rPr>
+        <w:t>try/except</w:t>
+      </w:r>
+      <w:r>
+        <w:rPr>
+          <w:sz w:val="28"/>
+          <w:szCs w:val="28"/>
+          <w:lang w:val="ru-UA"/>
+        </w:rPr>
+        <w:t xml:space="preserve"> для перехоплення та безпечної обробки типових помилок: </w:t>
+      </w:r>
+      <w:r>
+        <w:rPr>
+          <w:rStyle w:val="HTML"/>
+          <w:rFonts w:ascii="Times New Roman" w:hAnsi="Times New Roman" w:cs="Times New Roman"/>
+          <w:sz w:val="28"/>
+          <w:szCs w:val="28"/>
+          <w:lang w:val="ru-UA"/>
+        </w:rPr>
+        <w:t>ValueError</w:t>
+      </w:r>
+      <w:r>
+        <w:rPr>
+          <w:sz w:val="28"/>
+          <w:szCs w:val="28"/>
+          <w:lang w:val="ru-UA"/>
+        </w:rPr>
+        <w:t xml:space="preserve"> (некоректний тип введених даних) та </w:t>
+      </w:r>
+      <w:r>
+        <w:rPr>
+          <w:rStyle w:val="HTML"/>
+          <w:rFonts w:ascii="Times New Roman" w:hAnsi="Times New Roman" w:cs="Times New Roman"/>
+          <w:sz w:val="28"/>
+          <w:szCs w:val="28"/>
+          <w:lang w:val="ru-UA"/>
+        </w:rPr>
+        <w:t>ZeroDivisionError</w:t>
+      </w:r>
+      <w:r>
+        <w:rPr>
+          <w:sz w:val="28"/>
+          <w:szCs w:val="28"/>
+          <w:lang w:val="ru-UA"/>
+        </w:rPr>
+        <w:t xml:space="preserve"> (спроба ділення на нуль). Використання цих інструментів дозволило зробити програму-калькулятор "відмовостійкою", запобігти її аварійному завершенню при некоректних діях користувача та забезпечити стабільну роботу в нескінченному циклі.</w:t>
+      </w:r>
+    </w:p>
+    <w:p>
+      <w:pPr>
+        <w:rPr>
+          <w:lang w:val="ru-UA"/>
+        </w:rPr>
+      </w:pPr>
+    </w:p>
+    <w:p>
+      <w:pPr>
+        <w:rPr>
+          <w:lang w:val="ru-UA"/>
+        </w:rPr>
+      </w:pPr>
+    </w:p>
+    <w:p>
+      <w:pPr>
+        <w:rPr>
+          <w:lang w:val="ru-UA"/>
+        </w:rPr>
+      </w:pPr>
+    </w:p>
     <w:sectPr>
-      <w:headerReference w:type="default" r:id="rId19"/>
+      <w:headerReference w:type="default" r:id="rId20"/>
       <w:pgSz w:w="12240" w:h="15840"/>
       <w:pgMar w:top="1440" w:right="1440" w:bottom="1440" w:left="1440" w:header="720" w:footer="720" w:gutter="0"/>
       <w:cols w:space="720"/>
@@ -16969,6 +19804,119 @@
     </w:lvl>
   </w:abstractNum>
   <w:abstractNum w:abstractNumId="1" w15:restartNumberingAfterBreak="0">
+    <w:nsid w:val="20F224FD"/>
+    <w:multiLevelType w:val="multilevel"/>
+    <w:tmpl w:val="519AE222"/>
+    <w:lvl w:ilvl="0">
+      <w:start w:val="1"/>
+      <w:numFmt w:val="decimal"/>
+      <w:lvlText w:val="%1."/>
+      <w:lvlJc w:val="left"/>
+      <w:pPr>
+        <w:tabs>
+          <w:tab w:val="num" w:pos="720"/>
+        </w:tabs>
+        <w:ind w:left="720" w:hanging="360"/>
+      </w:pPr>
+    </w:lvl>
+    <w:lvl w:ilvl="1" w:tentative="1">
+      <w:start w:val="1"/>
+      <w:numFmt w:val="decimal"/>
+      <w:lvlText w:val="%2."/>
+      <w:lvlJc w:val="left"/>
+      <w:pPr>
+        <w:tabs>
+          <w:tab w:val="num" w:pos="1440"/>
+        </w:tabs>
+        <w:ind w:left="1440" w:hanging="360"/>
+      </w:pPr>
+    </w:lvl>
+    <w:lvl w:ilvl="2" w:tentative="1">
+      <w:start w:val="1"/>
+      <w:numFmt w:val="decimal"/>
+      <w:lvlText w:val="%3."/>
+      <w:lvlJc w:val="left"/>
+      <w:pPr>
+        <w:tabs>
+          <w:tab w:val="num" w:pos="2160"/>
+        </w:tabs>
+        <w:ind w:left="2160" w:hanging="360"/>
+      </w:pPr>
+    </w:lvl>
+    <w:lvl w:ilvl="3" w:tentative="1">
+      <w:start w:val="1"/>
+      <w:numFmt w:val="decimal"/>
+      <w:lvlText w:val="%4."/>
+      <w:lvlJc w:val="left"/>
+      <w:pPr>
+        <w:tabs>
+          <w:tab w:val="num" w:pos="2880"/>
+        </w:tabs>
+        <w:ind w:left="2880" w:hanging="360"/>
+      </w:pPr>
+    </w:lvl>
+    <w:lvl w:ilvl="4" w:tentative="1">
+      <w:start w:val="1"/>
+      <w:numFmt w:val="decimal"/>
+      <w:lvlText w:val="%5."/>
+      <w:lvlJc w:val="left"/>
+      <w:pPr>
+        <w:tabs>
+          <w:tab w:val="num" w:pos="3600"/>
+        </w:tabs>
+        <w:ind w:left="3600" w:hanging="360"/>
+      </w:pPr>
+    </w:lvl>
+    <w:lvl w:ilvl="5" w:tentative="1">
+      <w:start w:val="1"/>
+      <w:numFmt w:val="decimal"/>
+      <w:lvlText w:val="%6."/>
+      <w:lvlJc w:val="left"/>
+      <w:pPr>
+        <w:tabs>
+          <w:tab w:val="num" w:pos="4320"/>
+        </w:tabs>
+        <w:ind w:left="4320" w:hanging="360"/>
+      </w:pPr>
+    </w:lvl>
+    <w:lvl w:ilvl="6" w:tentative="1">
+      <w:start w:val="1"/>
+      <w:numFmt w:val="decimal"/>
+      <w:lvlText w:val="%7."/>
+      <w:lvlJc w:val="left"/>
+      <w:pPr>
+        <w:tabs>
+          <w:tab w:val="num" w:pos="5040"/>
+        </w:tabs>
+        <w:ind w:left="5040" w:hanging="360"/>
+      </w:pPr>
+    </w:lvl>
+    <w:lvl w:ilvl="7" w:tentative="1">
+      <w:start w:val="1"/>
+      <w:numFmt w:val="decimal"/>
+      <w:lvlText w:val="%8."/>
+      <w:lvlJc w:val="left"/>
+      <w:pPr>
+        <w:tabs>
+          <w:tab w:val="num" w:pos="5760"/>
+        </w:tabs>
+        <w:ind w:left="5760" w:hanging="360"/>
+      </w:pPr>
+    </w:lvl>
+    <w:lvl w:ilvl="8" w:tentative="1">
+      <w:start w:val="1"/>
+      <w:numFmt w:val="decimal"/>
+      <w:lvlText w:val="%9."/>
+      <w:lvlJc w:val="left"/>
+      <w:pPr>
+        <w:tabs>
+          <w:tab w:val="num" w:pos="6480"/>
+        </w:tabs>
+        <w:ind w:left="6480" w:hanging="360"/>
+      </w:pPr>
+    </w:lvl>
+  </w:abstractNum>
+  <w:abstractNum w:abstractNumId="2" w15:restartNumberingAfterBreak="0">
     <w:nsid w:val="26ED0FE8"/>
     <w:multiLevelType w:val="multilevel"/>
     <w:tmpl w:val="D4541474"/>
@@ -17081,7 +20029,7 @@
       </w:pPr>
     </w:lvl>
   </w:abstractNum>
-  <w:abstractNum w:abstractNumId="2" w15:restartNumberingAfterBreak="0">
+  <w:abstractNum w:abstractNumId="3" w15:restartNumberingAfterBreak="0">
     <w:nsid w:val="2A303198"/>
     <w:multiLevelType w:val="multilevel"/>
     <w:tmpl w:val="99107610"/>
@@ -17194,7 +20142,7 @@
       </w:pPr>
     </w:lvl>
   </w:abstractNum>
-  <w:abstractNum w:abstractNumId="3" w15:restartNumberingAfterBreak="0">
+  <w:abstractNum w:abstractNumId="4" w15:restartNumberingAfterBreak="0">
     <w:nsid w:val="308061CF"/>
     <w:multiLevelType w:val="multilevel"/>
     <w:tmpl w:val="2E746CAC"/>
@@ -17307,7 +20255,7 @@
       </w:pPr>
     </w:lvl>
   </w:abstractNum>
-  <w:abstractNum w:abstractNumId="4" w15:restartNumberingAfterBreak="0">
+  <w:abstractNum w:abstractNumId="5" w15:restartNumberingAfterBreak="0">
     <w:nsid w:val="39010864"/>
     <w:multiLevelType w:val="multilevel"/>
     <w:tmpl w:val="3BF8F220"/>
@@ -17420,7 +20368,120 @@
       </w:pPr>
     </w:lvl>
   </w:abstractNum>
-  <w:abstractNum w:abstractNumId="5" w15:restartNumberingAfterBreak="0">
+  <w:abstractNum w:abstractNumId="6" w15:restartNumberingAfterBreak="0">
+    <w:nsid w:val="3B6E300B"/>
+    <w:multiLevelType w:val="multilevel"/>
+    <w:tmpl w:val="C666C520"/>
+    <w:lvl w:ilvl="0">
+      <w:start w:val="6"/>
+      <w:numFmt w:val="decimal"/>
+      <w:lvlText w:val="%1."/>
+      <w:lvlJc w:val="left"/>
+      <w:pPr>
+        <w:tabs>
+          <w:tab w:val="num" w:pos="720"/>
+        </w:tabs>
+        <w:ind w:left="720" w:hanging="360"/>
+      </w:pPr>
+    </w:lvl>
+    <w:lvl w:ilvl="1" w:tentative="1">
+      <w:start w:val="1"/>
+      <w:numFmt w:val="decimal"/>
+      <w:lvlText w:val="%2."/>
+      <w:lvlJc w:val="left"/>
+      <w:pPr>
+        <w:tabs>
+          <w:tab w:val="num" w:pos="1440"/>
+        </w:tabs>
+        <w:ind w:left="1440" w:hanging="360"/>
+      </w:pPr>
+    </w:lvl>
+    <w:lvl w:ilvl="2" w:tentative="1">
+      <w:start w:val="1"/>
+      <w:numFmt w:val="decimal"/>
+      <w:lvlText w:val="%3."/>
+      <w:lvlJc w:val="left"/>
+      <w:pPr>
+        <w:tabs>
+          <w:tab w:val="num" w:pos="2160"/>
+        </w:tabs>
+        <w:ind w:left="2160" w:hanging="360"/>
+      </w:pPr>
+    </w:lvl>
+    <w:lvl w:ilvl="3" w:tentative="1">
+      <w:start w:val="1"/>
+      <w:numFmt w:val="decimal"/>
+      <w:lvlText w:val="%4."/>
+      <w:lvlJc w:val="left"/>
+      <w:pPr>
+        <w:tabs>
+          <w:tab w:val="num" w:pos="2880"/>
+        </w:tabs>
+        <w:ind w:left="2880" w:hanging="360"/>
+      </w:pPr>
+    </w:lvl>
+    <w:lvl w:ilvl="4" w:tentative="1">
+      <w:start w:val="1"/>
+      <w:numFmt w:val="decimal"/>
+      <w:lvlText w:val="%5."/>
+      <w:lvlJc w:val="left"/>
+      <w:pPr>
+        <w:tabs>
+          <w:tab w:val="num" w:pos="3600"/>
+        </w:tabs>
+        <w:ind w:left="3600" w:hanging="360"/>
+      </w:pPr>
+    </w:lvl>
+    <w:lvl w:ilvl="5" w:tentative="1">
+      <w:start w:val="1"/>
+      <w:numFmt w:val="decimal"/>
+      <w:lvlText w:val="%6."/>
+      <w:lvlJc w:val="left"/>
+      <w:pPr>
+        <w:tabs>
+          <w:tab w:val="num" w:pos="4320"/>
+        </w:tabs>
+        <w:ind w:left="4320" w:hanging="360"/>
+      </w:pPr>
+    </w:lvl>
+    <w:lvl w:ilvl="6" w:tentative="1">
+      <w:start w:val="1"/>
+      <w:numFmt w:val="decimal"/>
+      <w:lvlText w:val="%7."/>
+      <w:lvlJc w:val="left"/>
+      <w:pPr>
+        <w:tabs>
+          <w:tab w:val="num" w:pos="5040"/>
+        </w:tabs>
+        <w:ind w:left="5040" w:hanging="360"/>
+      </w:pPr>
+    </w:lvl>
+    <w:lvl w:ilvl="7" w:tentative="1">
+      <w:start w:val="1"/>
+      <w:numFmt w:val="decimal"/>
+      <w:lvlText w:val="%8."/>
+      <w:lvlJc w:val="left"/>
+      <w:pPr>
+        <w:tabs>
+          <w:tab w:val="num" w:pos="5760"/>
+        </w:tabs>
+        <w:ind w:left="5760" w:hanging="360"/>
+      </w:pPr>
+    </w:lvl>
+    <w:lvl w:ilvl="8" w:tentative="1">
+      <w:start w:val="1"/>
+      <w:numFmt w:val="decimal"/>
+      <w:lvlText w:val="%9."/>
+      <w:lvlJc w:val="left"/>
+      <w:pPr>
+        <w:tabs>
+          <w:tab w:val="num" w:pos="6480"/>
+        </w:tabs>
+        <w:ind w:left="6480" w:hanging="360"/>
+      </w:pPr>
+    </w:lvl>
+  </w:abstractNum>
+  <w:abstractNum w:abstractNumId="7" w15:restartNumberingAfterBreak="0">
     <w:nsid w:val="3C2925ED"/>
     <w:multiLevelType w:val="multilevel"/>
     <w:tmpl w:val="5218DDB0"/>
@@ -17533,7 +20594,7 @@
       </w:pPr>
     </w:lvl>
   </w:abstractNum>
-  <w:abstractNum w:abstractNumId="6" w15:restartNumberingAfterBreak="0">
+  <w:abstractNum w:abstractNumId="8" w15:restartNumberingAfterBreak="0">
     <w:nsid w:val="48720BD8"/>
     <w:multiLevelType w:val="hybridMultilevel"/>
     <w:tmpl w:val="0F6C27F6"/>
@@ -17619,7 +20680,7 @@
       </w:pPr>
     </w:lvl>
   </w:abstractNum>
-  <w:abstractNum w:abstractNumId="7" w15:restartNumberingAfterBreak="0">
+  <w:abstractNum w:abstractNumId="9" w15:restartNumberingAfterBreak="0">
     <w:nsid w:val="48D545CB"/>
     <w:multiLevelType w:val="multilevel"/>
     <w:tmpl w:val="9E6E86A6"/>
@@ -17732,7 +20793,7 @@
       </w:pPr>
     </w:lvl>
   </w:abstractNum>
-  <w:abstractNum w:abstractNumId="8" w15:restartNumberingAfterBreak="0">
+  <w:abstractNum w:abstractNumId="10" w15:restartNumberingAfterBreak="0">
     <w:nsid w:val="61597136"/>
     <w:multiLevelType w:val="hybridMultilevel"/>
     <w:tmpl w:val="CBC02F5A"/>
@@ -17821,7 +20882,7 @@
       </w:pPr>
     </w:lvl>
   </w:abstractNum>
-  <w:abstractNum w:abstractNumId="9" w15:restartNumberingAfterBreak="0">
+  <w:abstractNum w:abstractNumId="11" w15:restartNumberingAfterBreak="0">
     <w:nsid w:val="6CE54FE5"/>
     <w:multiLevelType w:val="hybridMultilevel"/>
     <w:tmpl w:val="0C7EA7EA"/>
@@ -17913,7 +20974,7 @@
       </w:pPr>
     </w:lvl>
   </w:abstractNum>
-  <w:abstractNum w:abstractNumId="10" w15:restartNumberingAfterBreak="0">
+  <w:abstractNum w:abstractNumId="12" w15:restartNumberingAfterBreak="0">
     <w:nsid w:val="6FBF4652"/>
     <w:multiLevelType w:val="multilevel"/>
     <w:tmpl w:val="DA90778A"/>
@@ -18026,7 +21087,7 @@
       </w:pPr>
     </w:lvl>
   </w:abstractNum>
-  <w:abstractNum w:abstractNumId="11" w15:restartNumberingAfterBreak="0">
+  <w:abstractNum w:abstractNumId="13" w15:restartNumberingAfterBreak="0">
     <w:nsid w:val="73E0389F"/>
     <w:multiLevelType w:val="hybridMultilevel"/>
     <w:tmpl w:val="0C7EA7EA"/>
@@ -18118,7 +21179,233 @@
       </w:pPr>
     </w:lvl>
   </w:abstractNum>
-  <w:abstractNum w:abstractNumId="12" w15:restartNumberingAfterBreak="0">
+  <w:abstractNum w:abstractNumId="14" w15:restartNumberingAfterBreak="0">
+    <w:nsid w:val="774E2B34"/>
+    <w:multiLevelType w:val="multilevel"/>
+    <w:tmpl w:val="56B01782"/>
+    <w:lvl w:ilvl="0">
+      <w:start w:val="1"/>
+      <w:numFmt w:val="decimal"/>
+      <w:lvlText w:val="%1)"/>
+      <w:lvlJc w:val="left"/>
+      <w:pPr>
+        <w:tabs>
+          <w:tab w:val="num" w:pos="720"/>
+        </w:tabs>
+        <w:ind w:left="720" w:hanging="360"/>
+      </w:pPr>
+    </w:lvl>
+    <w:lvl w:ilvl="1" w:tentative="1">
+      <w:start w:val="1"/>
+      <w:numFmt w:val="decimal"/>
+      <w:lvlText w:val="%2."/>
+      <w:lvlJc w:val="left"/>
+      <w:pPr>
+        <w:tabs>
+          <w:tab w:val="num" w:pos="1440"/>
+        </w:tabs>
+        <w:ind w:left="1440" w:hanging="360"/>
+      </w:pPr>
+    </w:lvl>
+    <w:lvl w:ilvl="2" w:tentative="1">
+      <w:start w:val="1"/>
+      <w:numFmt w:val="decimal"/>
+      <w:lvlText w:val="%3."/>
+      <w:lvlJc w:val="left"/>
+      <w:pPr>
+        <w:tabs>
+          <w:tab w:val="num" w:pos="2160"/>
+        </w:tabs>
+        <w:ind w:left="2160" w:hanging="360"/>
+      </w:pPr>
+    </w:lvl>
+    <w:lvl w:ilvl="3" w:tentative="1">
+      <w:start w:val="1"/>
+      <w:numFmt w:val="decimal"/>
+      <w:lvlText w:val="%4."/>
+      <w:lvlJc w:val="left"/>
+      <w:pPr>
+        <w:tabs>
+          <w:tab w:val="num" w:pos="2880"/>
+        </w:tabs>
+        <w:ind w:left="2880" w:hanging="360"/>
+      </w:pPr>
+    </w:lvl>
+    <w:lvl w:ilvl="4" w:tentative="1">
+      <w:start w:val="1"/>
+      <w:numFmt w:val="decimal"/>
+      <w:lvlText w:val="%5."/>
+      <w:lvlJc w:val="left"/>
+      <w:pPr>
+        <w:tabs>
+          <w:tab w:val="num" w:pos="3600"/>
+        </w:tabs>
+        <w:ind w:left="3600" w:hanging="360"/>
+      </w:pPr>
+    </w:lvl>
+    <w:lvl w:ilvl="5" w:tentative="1">
+      <w:start w:val="1"/>
+      <w:numFmt w:val="decimal"/>
+      <w:lvlText w:val="%6."/>
+      <w:lvlJc w:val="left"/>
+      <w:pPr>
+        <w:tabs>
+          <w:tab w:val="num" w:pos="4320"/>
+        </w:tabs>
+        <w:ind w:left="4320" w:hanging="360"/>
+      </w:pPr>
+    </w:lvl>
+    <w:lvl w:ilvl="6" w:tentative="1">
+      <w:start w:val="1"/>
+      <w:numFmt w:val="decimal"/>
+      <w:lvlText w:val="%7."/>
+      <w:lvlJc w:val="left"/>
+      <w:pPr>
+        <w:tabs>
+          <w:tab w:val="num" w:pos="5040"/>
+        </w:tabs>
+        <w:ind w:left="5040" w:hanging="360"/>
+      </w:pPr>
+    </w:lvl>
+    <w:lvl w:ilvl="7" w:tentative="1">
+      <w:start w:val="1"/>
+      <w:numFmt w:val="decimal"/>
+      <w:lvlText w:val="%8."/>
+      <w:lvlJc w:val="left"/>
+      <w:pPr>
+        <w:tabs>
+          <w:tab w:val="num" w:pos="5760"/>
+        </w:tabs>
+        <w:ind w:left="5760" w:hanging="360"/>
+      </w:pPr>
+    </w:lvl>
+    <w:lvl w:ilvl="8" w:tentative="1">
+      <w:start w:val="1"/>
+      <w:numFmt w:val="decimal"/>
+      <w:lvlText w:val="%9."/>
+      <w:lvlJc w:val="left"/>
+      <w:pPr>
+        <w:tabs>
+          <w:tab w:val="num" w:pos="6480"/>
+        </w:tabs>
+        <w:ind w:left="6480" w:hanging="360"/>
+      </w:pPr>
+    </w:lvl>
+  </w:abstractNum>
+  <w:abstractNum w:abstractNumId="15" w15:restartNumberingAfterBreak="0">
+    <w:nsid w:val="7B7930CA"/>
+    <w:multiLevelType w:val="multilevel"/>
+    <w:tmpl w:val="EADEF93E"/>
+    <w:lvl w:ilvl="0">
+      <w:start w:val="1"/>
+      <w:numFmt w:val="decimal"/>
+      <w:lvlText w:val="%1."/>
+      <w:lvlJc w:val="left"/>
+      <w:pPr>
+        <w:tabs>
+          <w:tab w:val="num" w:pos="720"/>
+        </w:tabs>
+        <w:ind w:left="720" w:hanging="360"/>
+      </w:pPr>
+    </w:lvl>
+    <w:lvl w:ilvl="1" w:tentative="1">
+      <w:start w:val="1"/>
+      <w:numFmt w:val="decimal"/>
+      <w:lvlText w:val="%2."/>
+      <w:lvlJc w:val="left"/>
+      <w:pPr>
+        <w:tabs>
+          <w:tab w:val="num" w:pos="1440"/>
+        </w:tabs>
+        <w:ind w:left="1440" w:hanging="360"/>
+      </w:pPr>
+    </w:lvl>
+    <w:lvl w:ilvl="2" w:tentative="1">
+      <w:start w:val="1"/>
+      <w:numFmt w:val="decimal"/>
+      <w:lvlText w:val="%3."/>
+      <w:lvlJc w:val="left"/>
+      <w:pPr>
+        <w:tabs>
+          <w:tab w:val="num" w:pos="2160"/>
+        </w:tabs>
+        <w:ind w:left="2160" w:hanging="360"/>
+      </w:pPr>
+    </w:lvl>
+    <w:lvl w:ilvl="3" w:tentative="1">
+      <w:start w:val="1"/>
+      <w:numFmt w:val="decimal"/>
+      <w:lvlText w:val="%4."/>
+      <w:lvlJc w:val="left"/>
+      <w:pPr>
+        <w:tabs>
+          <w:tab w:val="num" w:pos="2880"/>
+        </w:tabs>
+        <w:ind w:left="2880" w:hanging="360"/>
+      </w:pPr>
+    </w:lvl>
+    <w:lvl w:ilvl="4" w:tentative="1">
+      <w:start w:val="1"/>
+      <w:numFmt w:val="decimal"/>
+      <w:lvlText w:val="%5."/>
+      <w:lvlJc w:val="left"/>
+      <w:pPr>
+        <w:tabs>
+          <w:tab w:val="num" w:pos="3600"/>
+        </w:tabs>
+        <w:ind w:left="3600" w:hanging="360"/>
+      </w:pPr>
+    </w:lvl>
+    <w:lvl w:ilvl="5" w:tentative="1">
+      <w:start w:val="1"/>
+      <w:numFmt w:val="decimal"/>
+      <w:lvlText w:val="%6."/>
+      <w:lvlJc w:val="left"/>
+      <w:pPr>
+        <w:tabs>
+          <w:tab w:val="num" w:pos="4320"/>
+        </w:tabs>
+        <w:ind w:left="4320" w:hanging="360"/>
+      </w:pPr>
+    </w:lvl>
+    <w:lvl w:ilvl="6" w:tentative="1">
+      <w:start w:val="1"/>
+      <w:numFmt w:val="decimal"/>
+      <w:lvlText w:val="%7."/>
+      <w:lvlJc w:val="left"/>
+      <w:pPr>
+        <w:tabs>
+          <w:tab w:val="num" w:pos="5040"/>
+        </w:tabs>
+        <w:ind w:left="5040" w:hanging="360"/>
+      </w:pPr>
+    </w:lvl>
+    <w:lvl w:ilvl="7" w:tentative="1">
+      <w:start w:val="1"/>
+      <w:numFmt w:val="decimal"/>
+      <w:lvlText w:val="%8."/>
+      <w:lvlJc w:val="left"/>
+      <w:pPr>
+        <w:tabs>
+          <w:tab w:val="num" w:pos="5760"/>
+        </w:tabs>
+        <w:ind w:left="5760" w:hanging="360"/>
+      </w:pPr>
+    </w:lvl>
+    <w:lvl w:ilvl="8" w:tentative="1">
+      <w:start w:val="1"/>
+      <w:numFmt w:val="decimal"/>
+      <w:lvlText w:val="%9."/>
+      <w:lvlJc w:val="left"/>
+      <w:pPr>
+        <w:tabs>
+          <w:tab w:val="num" w:pos="6480"/>
+        </w:tabs>
+        <w:ind w:left="6480" w:hanging="360"/>
+      </w:pPr>
+    </w:lvl>
+  </w:abstractNum>
+  <w:abstractNum w:abstractNumId="16" w15:restartNumberingAfterBreak="0">
     <w:nsid w:val="7E7C35C9"/>
     <w:multiLevelType w:val="hybridMultilevel"/>
     <w:tmpl w:val="3318AB4C"/>
@@ -18205,43 +21492,55 @@
     </w:lvl>
   </w:abstractNum>
   <w:num w:numId="1">
+    <w:abstractNumId w:val="11"/>
+  </w:num>
+  <w:num w:numId="2">
+    <w:abstractNumId w:val="16"/>
+  </w:num>
+  <w:num w:numId="3">
+    <w:abstractNumId w:val="8"/>
+  </w:num>
+  <w:num w:numId="4">
+    <w:abstractNumId w:val="13"/>
+  </w:num>
+  <w:num w:numId="5">
+    <w:abstractNumId w:val="10"/>
+  </w:num>
+  <w:num w:numId="6">
     <w:abstractNumId w:val="9"/>
   </w:num>
-  <w:num w:numId="2">
+  <w:num w:numId="7">
+    <w:abstractNumId w:val="3"/>
+  </w:num>
+  <w:num w:numId="8">
     <w:abstractNumId w:val="12"/>
   </w:num>
-  <w:num w:numId="3">
-    <w:abstractNumId w:val="6"/>
-  </w:num>
-  <w:num w:numId="4">
-    <w:abstractNumId w:val="11"/>
-  </w:num>
-  <w:num w:numId="5">
-    <w:abstractNumId w:val="8"/>
-  </w:num>
-  <w:num w:numId="6">
-    <w:abstractNumId w:val="7"/>
-  </w:num>
-  <w:num w:numId="7">
+  <w:num w:numId="9">
     <w:abstractNumId w:val="2"/>
-  </w:num>
-  <w:num w:numId="8">
-    <w:abstractNumId w:val="10"/>
-  </w:num>
-  <w:num w:numId="9">
-    <w:abstractNumId w:val="1"/>
   </w:num>
   <w:num w:numId="10">
     <w:abstractNumId w:val="0"/>
   </w:num>
   <w:num w:numId="11">
+    <w:abstractNumId w:val="5"/>
+  </w:num>
+  <w:num w:numId="12">
     <w:abstractNumId w:val="4"/>
   </w:num>
-  <w:num w:numId="12">
-    <w:abstractNumId w:val="3"/>
+  <w:num w:numId="13">
+    <w:abstractNumId w:val="7"/>
   </w:num>
-  <w:num w:numId="13">
-    <w:abstractNumId w:val="5"/>
+  <w:num w:numId="14">
+    <w:abstractNumId w:val="1"/>
+  </w:num>
+  <w:num w:numId="15">
+    <w:abstractNumId w:val="15"/>
+  </w:num>
+  <w:num w:numId="16">
+    <w:abstractNumId w:val="6"/>
+  </w:num>
+  <w:num w:numId="17">
+    <w:abstractNumId w:val="14"/>
   </w:num>
 </w:numbering>
 </file>
@@ -18639,7 +21938,7 @@
   <w:style w:type="paragraph" w:default="1" w:styleId="a">
     <w:name w:val="Normal"/>
     <w:qFormat/>
-    <w:rsid w:val="00AB6B89"/>
+    <w:rsid w:val="002F6C47"/>
     <w:pPr>
       <w:spacing w:line="360" w:lineRule="auto"/>
       <w:ind w:firstLine="720"/>

</xml_diff>